<commit_message>
CV update and Deepgreen publication
</commit_message>
<xml_diff>
--- a/Media/Assets/CV_Word.docx
+++ b/Media/Assets/CV_Word.docx
@@ -1,6 +1,6 @@
 
 <file path=word/document.xml><?xml version="1.0" encoding="utf-8"?>
-<w:document xmlns:wpc="http://schemas.microsoft.com/office/word/2010/wordprocessingCanvas" xmlns:cx="http://schemas.microsoft.com/office/drawing/2014/chartex" xmlns:cx1="http://schemas.microsoft.com/office/drawing/2015/9/8/chartex" xmlns:cx2="http://schemas.microsoft.com/office/drawing/2015/10/21/chartex" xmlns:cx3="http://schemas.microsoft.com/office/drawing/2016/5/9/chartex" xmlns:cx4="http://schemas.microsoft.com/office/drawing/2016/5/10/chartex" xmlns:cx5="http://schemas.microsoft.com/office/drawing/2016/5/11/chartex" xmlns:cx6="http://schemas.microsoft.com/office/drawing/2016/5/12/chartex" xmlns:cx7="http://schemas.microsoft.com/office/drawing/2016/5/13/chartex" xmlns:cx8="http://schemas.microsoft.com/office/drawing/2016/5/14/chartex" xmlns:mc="http://schemas.openxmlformats.org/markup-compatibility/2006" xmlns:aink="http://schemas.microsoft.com/office/drawing/2016/ink" xmlns:am3d="http://schemas.microsoft.com/office/drawing/2017/model3d" xmlns:o="urn:schemas-microsoft-com:office:office" xmlns:oel="http://schemas.microsoft.com/office/2019/extlst" xmlns:r="http://schemas.openxmlformats.org/officeDocument/2006/relationships" xmlns:m="http://schemas.openxmlformats.org/officeDocument/2006/math" xmlns:v="urn:schemas-microsoft-com:vml" xmlns:wp14="http://schemas.microsoft.com/office/word/2010/wordprocessingDrawing" xmlns:wp="http://schemas.openxmlformats.org/drawingml/2006/wordprocessingDrawing" xmlns:w10="urn:schemas-microsoft-com:office:word" xmlns:w="http://schemas.openxmlformats.org/wordprocessingml/2006/main" xmlns:w14="http://schemas.microsoft.com/office/word/2010/wordml" xmlns:w15="http://schemas.microsoft.com/office/word/2012/wordml" xmlns:w16cex="http://schemas.microsoft.com/office/word/2018/wordml/cex" xmlns:w16cid="http://schemas.microsoft.com/office/word/2016/wordml/cid" xmlns:w16="http://schemas.microsoft.com/office/word/2018/wordml" xmlns:w16sdtdh="http://schemas.microsoft.com/office/word/2020/wordml/sdtdatahash" xmlns:w16se="http://schemas.microsoft.com/office/word/2015/wordml/symex" xmlns:wpg="http://schemas.microsoft.com/office/word/2010/wordprocessingGroup" xmlns:wpi="http://schemas.microsoft.com/office/word/2010/wordprocessingInk" xmlns:wne="http://schemas.microsoft.com/office/word/2006/wordml" xmlns:wps="http://schemas.microsoft.com/office/word/2010/wordprocessingShape" mc:Ignorable="w14 w15 w16se w16cid w16 w16cex w16sdtdh wp14">
+<w:document xmlns:wpc="http://schemas.microsoft.com/office/word/2010/wordprocessingCanvas" xmlns:cx="http://schemas.microsoft.com/office/drawing/2014/chartex" xmlns:cx1="http://schemas.microsoft.com/office/drawing/2015/9/8/chartex" xmlns:cx2="http://schemas.microsoft.com/office/drawing/2015/10/21/chartex" xmlns:cx3="http://schemas.microsoft.com/office/drawing/2016/5/9/chartex" xmlns:cx4="http://schemas.microsoft.com/office/drawing/2016/5/10/chartex" xmlns:cx5="http://schemas.microsoft.com/office/drawing/2016/5/11/chartex" xmlns:cx6="http://schemas.microsoft.com/office/drawing/2016/5/12/chartex" xmlns:cx7="http://schemas.microsoft.com/office/drawing/2016/5/13/chartex" xmlns:cx8="http://schemas.microsoft.com/office/drawing/2016/5/14/chartex" xmlns:mc="http://schemas.openxmlformats.org/markup-compatibility/2006" xmlns:aink="http://schemas.microsoft.com/office/drawing/2016/ink" xmlns:am3d="http://schemas.microsoft.com/office/drawing/2017/model3d" xmlns:o="urn:schemas-microsoft-com:office:office" xmlns:oel="http://schemas.microsoft.com/office/2019/extlst" xmlns:r="http://schemas.openxmlformats.org/officeDocument/2006/relationships" xmlns:m="http://schemas.openxmlformats.org/officeDocument/2006/math" xmlns:v="urn:schemas-microsoft-com:vml" xmlns:wp14="http://schemas.microsoft.com/office/word/2010/wordprocessingDrawing" xmlns:wp="http://schemas.openxmlformats.org/drawingml/2006/wordprocessingDrawing" xmlns:w10="urn:schemas-microsoft-com:office:word" xmlns:w="http://schemas.openxmlformats.org/wordprocessingml/2006/main" xmlns:w14="http://schemas.microsoft.com/office/word/2010/wordml" xmlns:w15="http://schemas.microsoft.com/office/word/2012/wordml" xmlns:w16cex="http://schemas.microsoft.com/office/word/2018/wordml/cex" xmlns:w16cid="http://schemas.microsoft.com/office/word/2016/wordml/cid" xmlns:w16="http://schemas.microsoft.com/office/word/2018/wordml" xmlns:w16du="http://schemas.microsoft.com/office/word/2023/wordml/word16du" xmlns:w16sdtdh="http://schemas.microsoft.com/office/word/2020/wordml/sdtdatahash" xmlns:w16se="http://schemas.microsoft.com/office/word/2015/wordml/symex" xmlns:wpg="http://schemas.microsoft.com/office/word/2010/wordprocessingGroup" xmlns:wpi="http://schemas.microsoft.com/office/word/2010/wordprocessingInk" xmlns:wne="http://schemas.microsoft.com/office/word/2006/wordml" xmlns:wps="http://schemas.microsoft.com/office/word/2010/wordprocessingShape" mc:Ignorable="w14 w15 w16se w16cid w16 w16cex w16sdtdh w16du wp14">
   <w:body>
     <w:p>
       <w:pPr>
@@ -63,13 +63,7 @@
         <w:jc w:val="center"/>
       </w:pPr>
       <w:r>
-        <w:t>PhD Candidate, Clemson University</w:t>
-      </w:r>
-      <w:r>
-        <w:t xml:space="preserve"> | </w:t>
-      </w:r>
-      <w:r>
-        <w:t>Advis</w:t>
+        <w:t>PhD Candidate, Clemson University | Advis</w:t>
       </w:r>
       <w:r>
         <w:t>ed by</w:t>
@@ -132,7 +126,19 @@
         <w:t xml:space="preserve"> </w:t>
       </w:r>
       <w:r>
-        <w:t>applications, especially with GPUs. I am working towards my PhD dissertation at Clemson and have published research</w:t>
+        <w:t xml:space="preserve">applications </w:t>
+      </w:r>
+      <w:r>
+        <w:t xml:space="preserve">with a focus on </w:t>
+      </w:r>
+      <w:r>
+        <w:t>GPU</w:t>
+      </w:r>
+      <w:r>
+        <w:t>-acceleration</w:t>
+      </w:r>
+      <w:r>
+        <w:t>. I am working towards my PhD dissertation at Clemson and have published research</w:t>
       </w:r>
       <w:r>
         <w:t xml:space="preserve"> </w:t>
@@ -143,27 +149,20 @@
       <w:r>
         <w:t xml:space="preserve"> </w:t>
       </w:r>
-      <w:proofErr w:type="spellStart"/>
-      <w:r>
-        <w:t>SuperComputing</w:t>
-      </w:r>
-      <w:proofErr w:type="spellEnd"/>
-      <w:r>
-        <w:t xml:space="preserve"> conference -- for 2024 we will be in Atlanta, GA! My long-term career aspirations are to work as a</w:t>
+      <w:r>
+        <w:t>SuperComputing conference -- for 2024 we will be in Atlanta, GA</w:t>
+      </w:r>
+      <w:r>
+        <w:t>.</w:t>
+      </w:r>
+      <w:r>
+        <w:t xml:space="preserve"> My long-term career aspirations are to work as a</w:t>
       </w:r>
       <w:r>
         <w:t xml:space="preserve"> </w:t>
       </w:r>
       <w:r>
-        <w:t xml:space="preserve">Computer Scientist in the DoE National Labs and to continue serving the community at </w:t>
-      </w:r>
-      <w:proofErr w:type="spellStart"/>
-      <w:r>
-        <w:t>SuperComputing</w:t>
-      </w:r>
-      <w:proofErr w:type="spellEnd"/>
-      <w:r>
-        <w:t xml:space="preserve"> and other</w:t>
+        <w:t>Computer Scientist in the DoE National Labs and to continue serving the community at SuperComputing and other</w:t>
       </w:r>
       <w:r>
         <w:t xml:space="preserve"> </w:t>
@@ -219,31 +218,46 @@
         <w:t xml:space="preserve"> that software</w:t>
       </w:r>
       <w:r>
-        <w:t xml:space="preserve"> performance matters, but at large scales and </w:t>
+        <w:t xml:space="preserve"> performance matters but </w:t>
+      </w:r>
+      <w:r>
+        <w:t xml:space="preserve">optimizing </w:t>
+      </w:r>
+      <w:r>
+        <w:t xml:space="preserve">performance can </w:t>
+      </w:r>
+      <w:r>
+        <w:t xml:space="preserve">prove to be both </w:t>
+      </w:r>
+      <w:r>
+        <w:t>difficult and costly</w:t>
+      </w:r>
+      <w:r>
+        <w:t xml:space="preserve"> </w:t>
+      </w:r>
+      <w:r>
+        <w:t xml:space="preserve">at large scale </w:t>
+      </w:r>
+      <w:r>
+        <w:t xml:space="preserve">or </w:t>
       </w:r>
       <w:r>
         <w:t xml:space="preserve">when utilizing </w:t>
       </w:r>
       <w:r>
-        <w:t xml:space="preserve">novel hardware, </w:t>
-      </w:r>
-      <w:r>
-        <w:t xml:space="preserve">optimizing </w:t>
-      </w:r>
-      <w:r>
-        <w:t xml:space="preserve">performance can </w:t>
-      </w:r>
-      <w:r>
-        <w:t xml:space="preserve">prove to be both </w:t>
-      </w:r>
-      <w:r>
-        <w:t>difficult and costly. My research broadly focuses on maximizing performance of leadership HPC systems with</w:t>
+        <w:t>novel hardware. My research broadly focuses on maximizing performance of leadership HPC systems with</w:t>
       </w:r>
       <w:r>
         <w:t xml:space="preserve"> </w:t>
       </w:r>
       <w:r>
-        <w:t>common accelerator hardware. These efforts include application-specific tuning to best utilize available hardware and</w:t>
+        <w:t>common accelerator hardware</w:t>
+      </w:r>
+      <w:r>
+        <w:t xml:space="preserve"> and cutting-edge hardware technologies such as Single-Phase Liquid Immersion Cooling</w:t>
+      </w:r>
+      <w:r>
+        <w:t>. These efforts include application-specific tuning to best utilize available hardware and</w:t>
       </w:r>
       <w:r>
         <w:t xml:space="preserve"> </w:t>
@@ -282,21 +296,7 @@
           <w:sz w:val="24"/>
           <w:szCs w:val="24"/>
         </w:rPr>
-        <w:t xml:space="preserve">TOP </w:t>
-      </w:r>
-      <w:r>
-        <w:rPr>
-          <w:sz w:val="24"/>
-          <w:szCs w:val="24"/>
-        </w:rPr>
-        <w:t>RESEARCH INTERESTS</w:t>
-      </w:r>
-      <w:r>
-        <w:rPr>
-          <w:sz w:val="24"/>
-          <w:szCs w:val="24"/>
-        </w:rPr>
-        <w:t>:</w:t>
+        <w:t>TOP RESEARCH INTERESTS:</w:t>
       </w:r>
     </w:p>
     <w:p>
@@ -360,7 +360,13 @@
         </w:tabs>
       </w:pPr>
       <w:r>
-        <w:t>Machine Learning Applications: Natural Language Processing, Large Language Models, and Graph Neural Networks</w:t>
+        <w:t xml:space="preserve">Machine Learning Applications: Natural Language Processing, </w:t>
+      </w:r>
+      <w:r>
+        <w:t xml:space="preserve">Bayesian Optimization, </w:t>
+      </w:r>
+      <w:r>
+        <w:t>Large Language Models</w:t>
       </w:r>
     </w:p>
     <w:p>
@@ -407,26 +413,13 @@
         </w:tabs>
       </w:pPr>
       <w:r>
-        <w:t xml:space="preserve">[ICS’23] Thomas Randall, </w:t>
-      </w:r>
-      <w:proofErr w:type="spellStart"/>
-      <w:r>
-        <w:t>Jaehoon</w:t>
-      </w:r>
-      <w:proofErr w:type="spellEnd"/>
-      <w:r>
-        <w:t xml:space="preserve"> Koo, </w:t>
-      </w:r>
-      <w:r>
-        <w:t xml:space="preserve">Brice Videau, Michael Kruse, </w:t>
-      </w:r>
-      <w:proofErr w:type="spellStart"/>
-      <w:r>
-        <w:t>Xingfu</w:t>
-      </w:r>
-      <w:proofErr w:type="spellEnd"/>
-      <w:r>
-        <w:t xml:space="preserve"> Wu, Paul Hovland, Mary</w:t>
+        <w:t>[In Preparation] Thomas Randall, Guoxi Liu, Federico Iuricich and Rong Ge, “Vector-Parallel Tetrahedral Mesh Processing</w:t>
+      </w:r>
+      <w:r>
+        <w:t xml:space="preserve"> for GPUs</w:t>
+      </w:r>
+      <w:r>
+        <w:t>”</w:t>
       </w:r>
     </w:p>
     <w:p>
@@ -435,20 +428,45 @@
         <w:tabs>
           <w:tab w:val="right" w:pos="9360"/>
         </w:tabs>
+      </w:pPr>
+      <w:r>
+        <w:t>[In Preparation] Thomas Randall, Arafat Hossain, Akash Dutta, Xingfu Wu, Ali Jannesari and Rong Ge, “Combining Generative Transfer Autotuning with Performance Modeling”</w:t>
+      </w:r>
+    </w:p>
+    <w:p>
+      <w:pPr>
+        <w:pStyle w:val="Body"/>
+        <w:tabs>
+          <w:tab w:val="right" w:pos="9360"/>
+        </w:tabs>
+      </w:pPr>
+      <w:r>
+        <w:t>[IGSC’24] Thomas Randall, Bennett Cooper, Naman Kulshreshtha and Rong Ge, “Thermal Behaviors in Liquid Immersion Cooling under Various Workloads: a Case Study”, In Proceedings of the 2024 International Green and Sustainable Computing Conference (IGSC ’24)</w:t>
+      </w:r>
+    </w:p>
+    <w:p>
+      <w:pPr>
+        <w:pStyle w:val="Body"/>
+        <w:tabs>
+          <w:tab w:val="right" w:pos="9360"/>
+        </w:tabs>
+      </w:pPr>
+      <w:r>
+        <w:t>[ICS’23] Thomas Randall, Jaehoon Koo, Brice Videau, Michael Kruse, Xingfu Wu, Paul Hovland, Mary</w:t>
+      </w:r>
+    </w:p>
+    <w:p>
+      <w:pPr>
+        <w:pStyle w:val="Body"/>
+        <w:tabs>
+          <w:tab w:val="right" w:pos="9360"/>
+        </w:tabs>
         <w:rPr>
           <w:rStyle w:val="Hyperlink"/>
         </w:rPr>
       </w:pPr>
       <w:r>
-        <w:t xml:space="preserve">Hall, Rong Ge and Prasanna </w:t>
-      </w:r>
-      <w:proofErr w:type="spellStart"/>
-      <w:r>
-        <w:t>Balaprakash</w:t>
-      </w:r>
-      <w:proofErr w:type="spellEnd"/>
-      <w:r>
-        <w:t>, “</w:t>
+        <w:t>Hall, Rong Ge and Prasanna Balaprakash, “</w:t>
       </w:r>
       <w:r>
         <w:fldChar w:fldCharType="begin"/>
@@ -541,15 +559,7 @@
           <w:sz w:val="24"/>
           <w:szCs w:val="24"/>
         </w:rPr>
-        <w:t>INVITED TALKS</w:t>
-      </w:r>
-      <w:r>
-        <w:rPr>
-          <w:rFonts w:ascii="Arial" w:hAnsi="Arial"/>
-          <w:sz w:val="24"/>
-          <w:szCs w:val="24"/>
-        </w:rPr>
-        <w:t xml:space="preserve"> AND FEATURED COVERAGE:</w:t>
+        <w:t>INVITED TALKS AND FEATURED COVERAGE:</w:t>
       </w:r>
     </w:p>
     <w:p>
@@ -801,16 +811,8 @@
         <w:rPr>
           <w:rFonts w:ascii="Arial" w:hAnsi="Arial"/>
         </w:rPr>
-        <w:t xml:space="preserve">Invited to discuss undergraduates’ interests in pursuing Graduate </w:t>
-      </w:r>
-      <w:proofErr w:type="gramStart"/>
-      <w:r>
-        <w:rPr>
-          <w:rFonts w:ascii="Arial" w:hAnsi="Arial"/>
-        </w:rPr>
-        <w:t>studies</w:t>
-      </w:r>
-      <w:proofErr w:type="gramEnd"/>
+        <w:t>Invited to discuss undergraduates’ interests in pursuing Graduate studies</w:t>
+      </w:r>
     </w:p>
     <w:p>
       <w:pPr>
@@ -835,276 +837,362 @@
           <w:sz w:val="24"/>
           <w:szCs w:val="24"/>
         </w:rPr>
-        <w:t>EDUCATION AND AWARDS</w:t>
-      </w:r>
-      <w:r>
+        <w:t>EDUCATION AND AWARDS:</w:t>
+      </w:r>
+    </w:p>
+    <w:p>
+      <w:pPr>
+        <w:pStyle w:val="Body"/>
+        <w:tabs>
+          <w:tab w:val="clear" w:pos="8910"/>
+          <w:tab w:val="right" w:pos="9360"/>
+        </w:tabs>
+      </w:pPr>
+      <w:r>
+        <w:t>Entered PhD Program at Clemson University</w:t>
+      </w:r>
+      <w:r>
+        <w:tab/>
+        <w:t>August 2019</w:t>
+      </w:r>
+    </w:p>
+    <w:p>
+      <w:pPr>
+        <w:pStyle w:val="Body"/>
+        <w:tabs>
+          <w:tab w:val="clear" w:pos="8910"/>
+          <w:tab w:val="right" w:pos="9360"/>
+        </w:tabs>
+      </w:pPr>
+      <w:r>
+        <w:t>Bachelor of Science in Computer Science</w:t>
+      </w:r>
+      <w:r>
+        <w:tab/>
+        <w:t>May 2019</w:t>
+      </w:r>
+    </w:p>
+    <w:p>
+      <w:pPr>
+        <w:pStyle w:val="Body"/>
+        <w:tabs>
+          <w:tab w:val="clear" w:pos="8910"/>
+          <w:tab w:val="right" w:pos="9360"/>
+        </w:tabs>
+      </w:pPr>
+      <w:r>
+        <w:t>Minor in Business Administration</w:t>
+      </w:r>
+      <w:r>
+        <w:tab/>
+        <w:t>Major GPA: 3.93/4.00</w:t>
+      </w:r>
+    </w:p>
+    <w:p>
+      <w:pPr>
+        <w:pStyle w:val="Body"/>
+        <w:tabs>
+          <w:tab w:val="clear" w:pos="8910"/>
+          <w:tab w:val="right" w:pos="9360"/>
+        </w:tabs>
+      </w:pPr>
+      <w:r>
+        <w:t>Clemson University</w:t>
+      </w:r>
+      <w:r>
+        <w:tab/>
+        <w:t>Clemson, SC</w:t>
+      </w:r>
+    </w:p>
+    <w:p>
+      <w:pPr>
+        <w:pStyle w:val="TableStyle2"/>
+        <w:tabs>
+          <w:tab w:val="right" w:pos="9360"/>
+        </w:tabs>
+        <w:rPr>
+          <w:rFonts w:ascii="Arial" w:hAnsi="Arial"/>
+        </w:rPr>
+      </w:pPr>
+    </w:p>
+    <w:p>
+      <w:pPr>
+        <w:pStyle w:val="TableStyle2"/>
+        <w:tabs>
+          <w:tab w:val="right" w:pos="9360"/>
+        </w:tabs>
+        <w:rPr>
+          <w:rFonts w:ascii="Arial" w:eastAsia="Arial" w:hAnsi="Arial" w:cs="Arial"/>
+        </w:rPr>
+      </w:pPr>
+      <w:r>
+        <w:rPr>
+          <w:rFonts w:ascii="Arial" w:hAnsi="Arial"/>
+        </w:rPr>
+        <w:t>ICS’21 Best Paper</w:t>
+      </w:r>
+      <w:r>
+        <w:rPr>
+          <w:rFonts w:ascii="Arial" w:hAnsi="Arial"/>
+        </w:rPr>
+        <w:tab/>
+        <w:t>Summer 2021</w:t>
+      </w:r>
+    </w:p>
+    <w:p>
+      <w:pPr>
+        <w:pStyle w:val="TableStyle2"/>
+        <w:tabs>
+          <w:tab w:val="right" w:pos="9360"/>
+        </w:tabs>
+        <w:rPr>
+          <w:rFonts w:ascii="Arial" w:eastAsia="Arial" w:hAnsi="Arial" w:cs="Arial"/>
+        </w:rPr>
+      </w:pPr>
+      <w:r>
+        <w:rPr>
+          <w:rFonts w:ascii="Arial" w:hAnsi="Arial"/>
+        </w:rPr>
+        <w:t>ANL GIVENS Scholar</w:t>
+      </w:r>
+      <w:r>
+        <w:rPr>
+          <w:rFonts w:ascii="Arial" w:hAnsi="Arial"/>
+        </w:rPr>
+        <w:tab/>
+        <w:t>Summer 2020, 2022</w:t>
+      </w:r>
+    </w:p>
+    <w:p>
+      <w:pPr>
+        <w:pStyle w:val="TableStyle2"/>
+        <w:tabs>
+          <w:tab w:val="right" w:pos="9360"/>
+        </w:tabs>
+        <w:rPr>
+          <w:rFonts w:ascii="Arial" w:hAnsi="Arial"/>
+        </w:rPr>
+      </w:pPr>
+      <w:r>
+        <w:rPr>
+          <w:rFonts w:ascii="Arial" w:hAnsi="Arial"/>
+        </w:rPr>
+        <w:t>R.C. Edwards Graduate Fellow</w:t>
+      </w:r>
+      <w:r>
+        <w:rPr>
+          <w:rFonts w:ascii="Arial" w:hAnsi="Arial"/>
+        </w:rPr>
+        <w:tab/>
+        <w:t>Fall 2019 -- Spring 2022</w:t>
+      </w:r>
+    </w:p>
+    <w:p>
+      <w:pPr>
+        <w:pStyle w:val="TableStyle2"/>
+        <w:tabs>
+          <w:tab w:val="right" w:pos="9360"/>
+        </w:tabs>
+        <w:rPr>
+          <w:rFonts w:ascii="Arial" w:eastAsia="Arial" w:hAnsi="Arial" w:cs="Arial"/>
+        </w:rPr>
+      </w:pPr>
+      <w:r>
+        <w:rPr>
+          <w:rFonts w:ascii="Arial" w:hAnsi="Arial"/>
+        </w:rPr>
+        <w:t>Clemson School of Computing Outstanding Undergraduate Researcher</w:t>
+      </w:r>
+      <w:r>
+        <w:rPr>
+          <w:rFonts w:ascii="Arial" w:hAnsi="Arial"/>
+        </w:rPr>
+        <w:tab/>
+        <w:t>Spring 2019</w:t>
+      </w:r>
+    </w:p>
+    <w:p>
+      <w:pPr>
+        <w:pStyle w:val="TableStyle2"/>
+        <w:tabs>
+          <w:tab w:val="right" w:pos="9360"/>
+        </w:tabs>
+        <w:rPr>
+          <w:rFonts w:ascii="Arial" w:eastAsia="Arial" w:hAnsi="Arial" w:cs="Arial"/>
+        </w:rPr>
+      </w:pPr>
+      <w:r>
+        <w:rPr>
+          <w:rFonts w:ascii="Arial" w:hAnsi="Arial"/>
+        </w:rPr>
+        <w:t>Dupont Best Undergraduate Project</w:t>
+      </w:r>
+      <w:r>
+        <w:rPr>
+          <w:rFonts w:ascii="Arial" w:hAnsi="Arial"/>
+        </w:rPr>
+        <w:tab/>
+        <w:t>Spring 2019</w:t>
+      </w:r>
+    </w:p>
+    <w:p>
+      <w:pPr>
+        <w:pStyle w:val="Body"/>
+        <w:tabs>
+          <w:tab w:val="clear" w:pos="8910"/>
+          <w:tab w:val="right" w:pos="9360"/>
+        </w:tabs>
         <w:rPr>
           <w:sz w:val="24"/>
           <w:szCs w:val="24"/>
         </w:rPr>
-        <w:t>:</w:t>
-      </w:r>
-    </w:p>
-    <w:p>
-      <w:pPr>
-        <w:pStyle w:val="Body"/>
-        <w:tabs>
-          <w:tab w:val="clear" w:pos="8910"/>
-          <w:tab w:val="right" w:pos="9360"/>
-        </w:tabs>
-      </w:pPr>
-      <w:r>
-        <w:t>Entered PhD Program at Clemson University</w:t>
-      </w:r>
-      <w:r>
-        <w:tab/>
-        <w:t>August 2019</w:t>
-      </w:r>
-    </w:p>
-    <w:p>
-      <w:pPr>
-        <w:pStyle w:val="Body"/>
-        <w:tabs>
-          <w:tab w:val="clear" w:pos="8910"/>
-          <w:tab w:val="right" w:pos="9360"/>
-        </w:tabs>
-      </w:pPr>
-    </w:p>
-    <w:p>
-      <w:pPr>
-        <w:pStyle w:val="Body"/>
-        <w:tabs>
-          <w:tab w:val="clear" w:pos="8910"/>
-          <w:tab w:val="right" w:pos="9360"/>
-        </w:tabs>
-      </w:pPr>
-      <w:r>
-        <w:t>Bachelor of Science in Computer Science</w:t>
-      </w:r>
-      <w:r>
-        <w:tab/>
-        <w:t>May 2019</w:t>
-      </w:r>
-    </w:p>
-    <w:p>
-      <w:pPr>
-        <w:pStyle w:val="Body"/>
-        <w:tabs>
-          <w:tab w:val="clear" w:pos="8910"/>
-          <w:tab w:val="right" w:pos="9360"/>
-        </w:tabs>
-      </w:pPr>
-      <w:r>
-        <w:t>Minor in Business Administration</w:t>
-      </w:r>
-      <w:r>
-        <w:tab/>
-        <w:t>Major GPA: 3.93/4.00</w:t>
-      </w:r>
-    </w:p>
-    <w:p>
-      <w:pPr>
-        <w:pStyle w:val="Body"/>
-        <w:tabs>
-          <w:tab w:val="clear" w:pos="8910"/>
-          <w:tab w:val="right" w:pos="9360"/>
-        </w:tabs>
-      </w:pPr>
-      <w:r>
-        <w:t>Clemson University</w:t>
-      </w:r>
-      <w:r>
-        <w:tab/>
-        <w:t>Clemson, SC</w:t>
-      </w:r>
-    </w:p>
-    <w:p>
-      <w:pPr>
-        <w:pStyle w:val="TableStyle2"/>
-        <w:tabs>
-          <w:tab w:val="right" w:pos="9360"/>
-        </w:tabs>
+      </w:pPr>
+    </w:p>
+    <w:p>
+      <w:pPr>
+        <w:pStyle w:val="TableStyle2"/>
         <w:rPr>
           <w:rFonts w:ascii="Arial" w:eastAsia="Arial" w:hAnsi="Arial" w:cs="Arial"/>
           <w:sz w:val="24"/>
           <w:szCs w:val="24"/>
         </w:rPr>
       </w:pPr>
-    </w:p>
-    <w:p>
-      <w:pPr>
-        <w:pStyle w:val="TableStyle2"/>
-        <w:tabs>
-          <w:tab w:val="right" w:pos="9360"/>
-        </w:tabs>
-        <w:rPr>
-          <w:rFonts w:ascii="Arial" w:eastAsia="Arial" w:hAnsi="Arial" w:cs="Arial"/>
-        </w:rPr>
-      </w:pPr>
-      <w:r>
-        <w:rPr>
-          <w:rFonts w:ascii="Arial" w:hAnsi="Arial"/>
-        </w:rPr>
-        <w:t>ICS’21 Best Paper</w:t>
-      </w:r>
-      <w:r>
-        <w:rPr>
-          <w:rFonts w:ascii="Arial" w:hAnsi="Arial"/>
-        </w:rPr>
-        <w:tab/>
-        <w:t>Summer 2021</w:t>
-      </w:r>
-    </w:p>
-    <w:p>
-      <w:pPr>
-        <w:pStyle w:val="TableStyle2"/>
-        <w:tabs>
-          <w:tab w:val="right" w:pos="9360"/>
-        </w:tabs>
-        <w:rPr>
-          <w:rFonts w:ascii="Arial" w:eastAsia="Arial" w:hAnsi="Arial" w:cs="Arial"/>
-        </w:rPr>
-      </w:pPr>
-      <w:r>
-        <w:rPr>
-          <w:rFonts w:ascii="Arial" w:hAnsi="Arial"/>
-        </w:rPr>
-        <w:t>ANL GIVENS Scholar</w:t>
-      </w:r>
-      <w:r>
-        <w:rPr>
-          <w:rFonts w:ascii="Arial" w:hAnsi="Arial"/>
-        </w:rPr>
-        <w:tab/>
-        <w:t>Summer 2020, 2022</w:t>
-      </w:r>
-    </w:p>
-    <w:p>
-      <w:pPr>
-        <w:pStyle w:val="TableStyle2"/>
-        <w:tabs>
-          <w:tab w:val="right" w:pos="9360"/>
-        </w:tabs>
-        <w:rPr>
-          <w:rFonts w:ascii="Arial" w:hAnsi="Arial"/>
-        </w:rPr>
-      </w:pPr>
-      <w:r>
-        <w:rPr>
-          <w:rFonts w:ascii="Arial" w:hAnsi="Arial"/>
-        </w:rPr>
-        <w:t>R.C. Edwards Graduate Fellow</w:t>
-      </w:r>
-      <w:r>
-        <w:rPr>
-          <w:rFonts w:ascii="Arial" w:hAnsi="Arial"/>
-        </w:rPr>
-        <w:tab/>
-        <w:t>Fall 2019 -- Spring 2022</w:t>
-      </w:r>
-    </w:p>
-    <w:p>
-      <w:pPr>
-        <w:pStyle w:val="TableStyle2"/>
-        <w:tabs>
-          <w:tab w:val="right" w:pos="9360"/>
-        </w:tabs>
-        <w:rPr>
-          <w:rFonts w:ascii="Arial" w:eastAsia="Arial" w:hAnsi="Arial" w:cs="Arial"/>
-        </w:rPr>
-      </w:pPr>
-      <w:r>
-        <w:rPr>
-          <w:rFonts w:ascii="Arial" w:hAnsi="Arial"/>
-        </w:rPr>
-        <w:t>Clemson School of Computing Outstanding Undergraduate Researcher</w:t>
-      </w:r>
-      <w:r>
-        <w:rPr>
-          <w:rFonts w:ascii="Arial" w:hAnsi="Arial"/>
-        </w:rPr>
-        <w:tab/>
-        <w:t>Spring 2019</w:t>
-      </w:r>
-    </w:p>
-    <w:p>
-      <w:pPr>
-        <w:pStyle w:val="TableStyle2"/>
-        <w:tabs>
-          <w:tab w:val="right" w:pos="9360"/>
-        </w:tabs>
-        <w:rPr>
-          <w:rFonts w:ascii="Arial" w:eastAsia="Arial" w:hAnsi="Arial" w:cs="Arial"/>
-        </w:rPr>
-      </w:pPr>
-      <w:r>
-        <w:rPr>
-          <w:rFonts w:ascii="Arial" w:hAnsi="Arial"/>
-        </w:rPr>
-        <w:t>Dupont Best Undergraduate Project</w:t>
-      </w:r>
-      <w:r>
-        <w:rPr>
-          <w:rFonts w:ascii="Arial" w:hAnsi="Arial"/>
-        </w:rPr>
-        <w:tab/>
-        <w:t>Spring 2019</w:t>
-      </w:r>
-    </w:p>
-    <w:p>
-      <w:pPr>
-        <w:pStyle w:val="Body"/>
-        <w:tabs>
-          <w:tab w:val="clear" w:pos="8910"/>
-          <w:tab w:val="right" w:pos="9360"/>
-        </w:tabs>
-        <w:rPr>
+      <w:r>
+        <w:rPr>
+          <w:rFonts w:ascii="Arial" w:hAnsi="Arial"/>
           <w:sz w:val="24"/>
           <w:szCs w:val="24"/>
         </w:rPr>
-      </w:pPr>
-    </w:p>
-    <w:p>
-      <w:pPr>
-        <w:pStyle w:val="TableStyle2"/>
-        <w:rPr>
-          <w:rFonts w:ascii="Arial" w:eastAsia="Arial" w:hAnsi="Arial" w:cs="Arial"/>
-          <w:sz w:val="24"/>
-          <w:szCs w:val="24"/>
-        </w:rPr>
-      </w:pPr>
-      <w:r>
-        <w:rPr>
-          <w:rFonts w:ascii="Arial" w:hAnsi="Arial"/>
-          <w:sz w:val="24"/>
-          <w:szCs w:val="24"/>
-        </w:rPr>
-        <w:t xml:space="preserve">LEADERSHIP </w:t>
-      </w:r>
-      <w:r>
-        <w:rPr>
-          <w:rFonts w:ascii="Arial" w:hAnsi="Arial"/>
-          <w:sz w:val="24"/>
-          <w:szCs w:val="24"/>
-        </w:rPr>
-        <w:t xml:space="preserve">AND TEACHING </w:t>
-      </w:r>
-      <w:r>
-        <w:rPr>
-          <w:rFonts w:ascii="Arial" w:hAnsi="Arial"/>
-          <w:sz w:val="24"/>
-          <w:szCs w:val="24"/>
-        </w:rPr>
-        <w:t>EXPERIENCE</w:t>
-      </w:r>
-      <w:r>
-        <w:rPr>
-          <w:rFonts w:ascii="Arial" w:hAnsi="Arial"/>
-          <w:sz w:val="24"/>
-          <w:szCs w:val="24"/>
-        </w:rPr>
-        <w:t>:</w:t>
-      </w:r>
+        <w:t>LEADERSHIP AND TEACHING EXPERIENCE:</w:t>
+      </w:r>
+    </w:p>
+    <w:p>
+      <w:pPr>
+        <w:pStyle w:val="TableStyle2"/>
+        <w:tabs>
+          <w:tab w:val="right" w:pos="9360"/>
+        </w:tabs>
+        <w:rPr>
+          <w:rFonts w:ascii="Arial" w:hAnsi="Arial"/>
+        </w:rPr>
+      </w:pPr>
+      <w:r>
+        <w:rPr>
+          <w:rFonts w:ascii="Arial" w:hAnsi="Arial"/>
+        </w:rPr>
+        <w:t>Vice President</w:t>
+      </w:r>
+      <w:r>
+        <w:rPr>
+          <w:rFonts w:ascii="Arial" w:hAnsi="Arial"/>
+        </w:rPr>
+        <w:tab/>
+        <w:t>Fall 2024</w:t>
+      </w:r>
+    </w:p>
+    <w:p>
+      <w:pPr>
+        <w:pStyle w:val="TableStyle2"/>
+        <w:tabs>
+          <w:tab w:val="right" w:pos="9360"/>
+        </w:tabs>
+        <w:rPr>
+          <w:rFonts w:ascii="Arial" w:hAnsi="Arial"/>
+        </w:rPr>
+      </w:pPr>
+      <w:r>
+        <w:rPr>
+          <w:rFonts w:ascii="Arial" w:hAnsi="Arial"/>
+        </w:rPr>
+        <w:t>School of Computing Graduate Student Association</w:t>
+      </w:r>
+      <w:r>
+        <w:rPr>
+          <w:rFonts w:ascii="Arial" w:hAnsi="Arial"/>
+        </w:rPr>
+        <w:tab/>
+        <w:t>Clemson, SC</w:t>
+      </w:r>
+    </w:p>
+    <w:p>
+      <w:pPr>
+        <w:pStyle w:val="TableStyle2"/>
+        <w:numPr>
+          <w:ilvl w:val="0"/>
+          <w:numId w:val="8"/>
+        </w:numPr>
+        <w:tabs>
+          <w:tab w:val="right" w:pos="9360"/>
+        </w:tabs>
+        <w:rPr>
+          <w:rFonts w:ascii="Arial" w:hAnsi="Arial"/>
+        </w:rPr>
+      </w:pPr>
+      <w:r>
+        <w:rPr>
+          <w:rFonts w:ascii="Arial" w:hAnsi="Arial"/>
+        </w:rPr>
+        <w:t>Organized 2 professional workshops, 3 social events and a fundraiser</w:t>
+      </w:r>
+    </w:p>
+    <w:p>
+      <w:pPr>
+        <w:pStyle w:val="TableStyle2"/>
+        <w:numPr>
+          <w:ilvl w:val="0"/>
+          <w:numId w:val="8"/>
+        </w:numPr>
+        <w:tabs>
+          <w:tab w:val="right" w:pos="9360"/>
+        </w:tabs>
+        <w:rPr>
+          <w:rFonts w:ascii="Arial" w:hAnsi="Arial"/>
+        </w:rPr>
+      </w:pPr>
+      <w:r>
+        <w:rPr>
+          <w:rFonts w:ascii="Arial" w:hAnsi="Arial"/>
+        </w:rPr>
+        <w:t>Coordinated with University staff to collaboratively enhance events</w:t>
+      </w:r>
+    </w:p>
+    <w:p>
+      <w:pPr>
+        <w:pStyle w:val="TableStyle2"/>
+        <w:numPr>
+          <w:ilvl w:val="0"/>
+          <w:numId w:val="8"/>
+        </w:numPr>
+        <w:tabs>
+          <w:tab w:val="right" w:pos="9360"/>
+        </w:tabs>
+        <w:rPr>
+          <w:rFonts w:ascii="Arial" w:hAnsi="Arial"/>
+        </w:rPr>
+      </w:pPr>
+      <w:r>
+        <w:rPr>
+          <w:rFonts w:ascii="Arial" w:hAnsi="Arial"/>
+        </w:rPr>
+        <w:t xml:space="preserve">Managed organization finances and </w:t>
+      </w:r>
+      <w:r>
+        <w:rPr>
+          <w:rFonts w:ascii="Arial" w:hAnsi="Arial"/>
+        </w:rPr>
+        <w:t>plans</w:t>
+      </w:r>
+    </w:p>
+    <w:p>
+      <w:pPr>
+        <w:pStyle w:val="TableStyle2"/>
+        <w:tabs>
+          <w:tab w:val="right" w:pos="9360"/>
+        </w:tabs>
+        <w:rPr>
+          <w:rFonts w:ascii="Arial" w:hAnsi="Arial"/>
+        </w:rPr>
+      </w:pPr>
     </w:p>
     <w:p>
       <w:pPr>
@@ -1193,16 +1281,8 @@
         <w:rPr>
           <w:rFonts w:ascii="Arial" w:hAnsi="Arial"/>
         </w:rPr>
-        <w:t xml:space="preserve">Oversaw 100+ volunteers facilitating conference </w:t>
-      </w:r>
-      <w:proofErr w:type="gramStart"/>
-      <w:r>
-        <w:rPr>
-          <w:rFonts w:ascii="Arial" w:hAnsi="Arial"/>
-        </w:rPr>
-        <w:t>events</w:t>
-      </w:r>
-      <w:proofErr w:type="gramEnd"/>
+        <w:t>Oversaw 100+ volunteers facilitating conference events</w:t>
+      </w:r>
     </w:p>
     <w:p>
       <w:pPr>
@@ -1222,30 +1302,8 @@
         <w:rPr>
           <w:rFonts w:ascii="Arial" w:hAnsi="Arial"/>
         </w:rPr>
-        <w:t xml:space="preserve">Organized and engaged new students at </w:t>
-      </w:r>
-      <w:proofErr w:type="spellStart"/>
-      <w:r>
-        <w:rPr>
-          <w:rFonts w:ascii="Arial" w:hAnsi="Arial"/>
-        </w:rPr>
-        <w:t>SuperComputing</w:t>
-      </w:r>
-      <w:proofErr w:type="spellEnd"/>
-      <w:r>
-        <w:rPr>
-          <w:rFonts w:ascii="Arial" w:hAnsi="Arial"/>
-        </w:rPr>
-        <w:t xml:space="preserve"> through cohort events and </w:t>
-      </w:r>
-      <w:proofErr w:type="gramStart"/>
-      <w:r>
-        <w:rPr>
-          <w:rFonts w:ascii="Arial" w:hAnsi="Arial"/>
-        </w:rPr>
-        <w:t>discussions</w:t>
-      </w:r>
-      <w:proofErr w:type="gramEnd"/>
+        <w:t>Organized and engaged new students at SuperComputing through cohort events and discussions</w:t>
+      </w:r>
     </w:p>
     <w:p>
       <w:pPr>
@@ -1272,43 +1330,14 @@
         <w:rPr>
           <w:rFonts w:ascii="Arial" w:hAnsi="Arial"/>
         </w:rPr>
-        <w:t>Student Volunteer</w:t>
-      </w:r>
-      <w:r>
-        <w:rPr>
-          <w:rFonts w:ascii="Arial" w:hAnsi="Arial"/>
-        </w:rPr>
-        <w:t>, Virtual Student Volunteer</w:t>
+        <w:t>Student Volunteer, Virtual Student Volunteer</w:t>
       </w:r>
       <w:r>
         <w:rPr>
           <w:rFonts w:ascii="Arial" w:hAnsi="Arial"/>
         </w:rPr>
         <w:tab/>
-      </w:r>
-      <w:r>
-        <w:rPr>
-          <w:rFonts w:ascii="Arial" w:hAnsi="Arial"/>
-        </w:rPr>
-        <w:t xml:space="preserve">Fall 2020 (Virtual), </w:t>
-      </w:r>
-      <w:r>
-        <w:rPr>
-          <w:rFonts w:ascii="Arial" w:hAnsi="Arial"/>
-        </w:rPr>
-        <w:t xml:space="preserve">Fall 2021, </w:t>
-      </w:r>
-      <w:r>
-        <w:rPr>
-          <w:rFonts w:ascii="Arial" w:hAnsi="Arial"/>
-        </w:rPr>
-        <w:t xml:space="preserve">Fall </w:t>
-      </w:r>
-      <w:r>
-        <w:rPr>
-          <w:rFonts w:ascii="Arial" w:hAnsi="Arial"/>
-        </w:rPr>
-        <w:t>2022</w:t>
+        <w:t>Fall 2020 (Virtual), Fall 2021, Fall 2022</w:t>
       </w:r>
     </w:p>
     <w:p>
@@ -1325,31 +1354,14 @@
         <w:rPr>
           <w:rFonts w:ascii="Arial" w:hAnsi="Arial"/>
         </w:rPr>
-        <w:t xml:space="preserve">SuperComputing’20, </w:t>
-      </w:r>
-      <w:r>
-        <w:rPr>
-          <w:rFonts w:ascii="Arial" w:hAnsi="Arial"/>
-        </w:rPr>
-        <w:t>SuperComputing’21, SuperComputing’22</w:t>
+        <w:t>SuperComputing’20, SuperComputing’21, SuperComputing’22</w:t>
       </w:r>
       <w:r>
         <w:rPr>
           <w:rFonts w:ascii="Arial" w:hAnsi="Arial"/>
         </w:rPr>
         <w:tab/>
-      </w:r>
-      <w:r>
-        <w:rPr>
-          <w:rFonts w:ascii="Arial" w:hAnsi="Arial"/>
-        </w:rPr>
-        <w:t xml:space="preserve">Online; </w:t>
-      </w:r>
-      <w:r>
-        <w:rPr>
-          <w:rFonts w:ascii="Arial" w:hAnsi="Arial"/>
-        </w:rPr>
-        <w:t>St. Louis, MO; Dallas, TX</w:t>
+        <w:t>Online; St. Louis, MO; Dallas, TX</w:t>
       </w:r>
     </w:p>
     <w:p>
@@ -1391,16 +1403,8 @@
         <w:rPr>
           <w:rFonts w:ascii="Arial" w:hAnsi="Arial"/>
         </w:rPr>
-        <w:t xml:space="preserve">Enable communications between conference organizers and </w:t>
-      </w:r>
-      <w:proofErr w:type="gramStart"/>
-      <w:r>
-        <w:rPr>
-          <w:rFonts w:ascii="Arial" w:hAnsi="Arial"/>
-        </w:rPr>
-        <w:t>presenters</w:t>
-      </w:r>
-      <w:proofErr w:type="gramEnd"/>
+        <w:t>Enable communications between conference organizers and presenters</w:t>
+      </w:r>
     </w:p>
     <w:p>
       <w:pPr>
@@ -1426,10 +1430,7 @@
       </w:r>
       <w:r>
         <w:tab/>
-        <w:t xml:space="preserve">Fall 2019 — </w:t>
-      </w:r>
-      <w:r>
-        <w:t>Spring 2023</w:t>
+        <w:t>Fall 2019 — Spring 2023</w:t>
       </w:r>
     </w:p>
     <w:p>
@@ -1469,15 +1470,7 @@
         </w:numPr>
       </w:pPr>
       <w:r>
-        <w:t xml:space="preserve">Prepared assignments, </w:t>
-      </w:r>
-      <w:proofErr w:type="gramStart"/>
-      <w:r>
-        <w:t>projects</w:t>
-      </w:r>
-      <w:proofErr w:type="gramEnd"/>
-      <w:r>
-        <w:t xml:space="preserve"> and homework for classes</w:t>
+        <w:t>Prepared assignments, projects and homework for classes</w:t>
       </w:r>
     </w:p>
     <w:p>
@@ -1525,13 +1518,7 @@
         </w:tabs>
       </w:pPr>
       <w:r>
-        <w:t>Lab</w:t>
-      </w:r>
-      <w:r>
-        <w:t>oratory</w:t>
-      </w:r>
-      <w:r>
-        <w:t xml:space="preserve"> Teaching Assistant</w:t>
+        <w:t>Laboratory Teaching Assistant</w:t>
       </w:r>
       <w:r>
         <w:tab/>
@@ -1584,17 +1571,8 @@
           <w:rFonts w:ascii="Arial" w:hAnsi="Arial"/>
           <w:lang w:val="fr-FR"/>
         </w:rPr>
-        <w:t xml:space="preserve"> </w:t>
-      </w:r>
-      <w:proofErr w:type="spellStart"/>
-      <w:r>
-        <w:rPr>
-          <w:rFonts w:ascii="Arial" w:hAnsi="Arial"/>
-          <w:lang w:val="fr-FR"/>
-        </w:rPr>
-        <w:t>lab</w:t>
-      </w:r>
-      <w:proofErr w:type="spellEnd"/>
+        <w:t xml:space="preserve"> lab</w:t>
+      </w:r>
       <w:r>
         <w:rPr>
           <w:rFonts w:ascii="Arial" w:hAnsi="Arial"/>
@@ -1617,19 +1595,7 @@
         <w:rPr>
           <w:rFonts w:ascii="Arial" w:hAnsi="Arial"/>
         </w:rPr>
-        <w:t>Aided students with questions and problems during</w:t>
-      </w:r>
-      <w:r>
-        <w:rPr>
-          <w:rFonts w:ascii="Arial" w:hAnsi="Arial"/>
-        </w:rPr>
-        <w:t xml:space="preserve"> </w:t>
-      </w:r>
-      <w:r>
-        <w:rPr>
-          <w:rFonts w:ascii="Arial" w:hAnsi="Arial"/>
-        </w:rPr>
-        <w:t>lab time and office hours</w:t>
+        <w:t>Aided students with questions and problems during lab time and office hours</w:t>
       </w:r>
     </w:p>
     <w:p>
@@ -1647,25 +1613,7 @@
         <w:rPr>
           <w:rFonts w:ascii="Arial" w:hAnsi="Arial"/>
         </w:rPr>
-        <w:t>Graded lab</w:t>
-      </w:r>
-      <w:r>
-        <w:rPr>
-          <w:rFonts w:ascii="Arial" w:hAnsi="Arial"/>
-        </w:rPr>
-        <w:t>oratory</w:t>
-      </w:r>
-      <w:r>
-        <w:rPr>
-          <w:rFonts w:ascii="Arial" w:hAnsi="Arial"/>
-        </w:rPr>
-        <w:t xml:space="preserve"> assignments</w:t>
-      </w:r>
-      <w:r>
-        <w:rPr>
-          <w:rFonts w:ascii="Arial" w:hAnsi="Arial"/>
-        </w:rPr>
-        <w:t xml:space="preserve"> for up to 30 students</w:t>
+        <w:t>Graded laboratory assignments for up to 30 students</w:t>
       </w:r>
     </w:p>
     <w:p>
@@ -1838,7 +1786,7 @@
 </file>
 
 <file path=word/endnotes.xml><?xml version="1.0" encoding="utf-8"?>
-<w:endnotes xmlns:wpc="http://schemas.microsoft.com/office/word/2010/wordprocessingCanvas" xmlns:cx="http://schemas.microsoft.com/office/drawing/2014/chartex" xmlns:cx1="http://schemas.microsoft.com/office/drawing/2015/9/8/chartex" xmlns:cx2="http://schemas.microsoft.com/office/drawing/2015/10/21/chartex" xmlns:cx3="http://schemas.microsoft.com/office/drawing/2016/5/9/chartex" xmlns:cx4="http://schemas.microsoft.com/office/drawing/2016/5/10/chartex" xmlns:cx5="http://schemas.microsoft.com/office/drawing/2016/5/11/chartex" xmlns:cx6="http://schemas.microsoft.com/office/drawing/2016/5/12/chartex" xmlns:cx7="http://schemas.microsoft.com/office/drawing/2016/5/13/chartex" xmlns:cx8="http://schemas.microsoft.com/office/drawing/2016/5/14/chartex" xmlns:mc="http://schemas.openxmlformats.org/markup-compatibility/2006" xmlns:aink="http://schemas.microsoft.com/office/drawing/2016/ink" xmlns:am3d="http://schemas.microsoft.com/office/drawing/2017/model3d" xmlns:o="urn:schemas-microsoft-com:office:office" xmlns:oel="http://schemas.microsoft.com/office/2019/extlst" xmlns:r="http://schemas.openxmlformats.org/officeDocument/2006/relationships" xmlns:m="http://schemas.openxmlformats.org/officeDocument/2006/math" xmlns:v="urn:schemas-microsoft-com:vml" xmlns:wp14="http://schemas.microsoft.com/office/word/2010/wordprocessingDrawing" xmlns:wp="http://schemas.openxmlformats.org/drawingml/2006/wordprocessingDrawing" xmlns:w10="urn:schemas-microsoft-com:office:word" xmlns:w="http://schemas.openxmlformats.org/wordprocessingml/2006/main" xmlns:w14="http://schemas.microsoft.com/office/word/2010/wordml" xmlns:w15="http://schemas.microsoft.com/office/word/2012/wordml" xmlns:w16cex="http://schemas.microsoft.com/office/word/2018/wordml/cex" xmlns:w16cid="http://schemas.microsoft.com/office/word/2016/wordml/cid" xmlns:w16="http://schemas.microsoft.com/office/word/2018/wordml" xmlns:w16sdtdh="http://schemas.microsoft.com/office/word/2020/wordml/sdtdatahash" xmlns:w16se="http://schemas.microsoft.com/office/word/2015/wordml/symex" xmlns:wpg="http://schemas.microsoft.com/office/word/2010/wordprocessingGroup" xmlns:wpi="http://schemas.microsoft.com/office/word/2010/wordprocessingInk" xmlns:wne="http://schemas.microsoft.com/office/word/2006/wordml" xmlns:wps="http://schemas.microsoft.com/office/word/2010/wordprocessingShape" mc:Ignorable="w14 w15 w16se w16cid w16 w16cex w16sdtdh wp14">
+<w:endnotes xmlns:wpc="http://schemas.microsoft.com/office/word/2010/wordprocessingCanvas" xmlns:cx="http://schemas.microsoft.com/office/drawing/2014/chartex" xmlns:cx1="http://schemas.microsoft.com/office/drawing/2015/9/8/chartex" xmlns:cx2="http://schemas.microsoft.com/office/drawing/2015/10/21/chartex" xmlns:cx3="http://schemas.microsoft.com/office/drawing/2016/5/9/chartex" xmlns:cx4="http://schemas.microsoft.com/office/drawing/2016/5/10/chartex" xmlns:cx5="http://schemas.microsoft.com/office/drawing/2016/5/11/chartex" xmlns:cx6="http://schemas.microsoft.com/office/drawing/2016/5/12/chartex" xmlns:cx7="http://schemas.microsoft.com/office/drawing/2016/5/13/chartex" xmlns:cx8="http://schemas.microsoft.com/office/drawing/2016/5/14/chartex" xmlns:mc="http://schemas.openxmlformats.org/markup-compatibility/2006" xmlns:aink="http://schemas.microsoft.com/office/drawing/2016/ink" xmlns:am3d="http://schemas.microsoft.com/office/drawing/2017/model3d" xmlns:o="urn:schemas-microsoft-com:office:office" xmlns:oel="http://schemas.microsoft.com/office/2019/extlst" xmlns:r="http://schemas.openxmlformats.org/officeDocument/2006/relationships" xmlns:m="http://schemas.openxmlformats.org/officeDocument/2006/math" xmlns:v="urn:schemas-microsoft-com:vml" xmlns:wp14="http://schemas.microsoft.com/office/word/2010/wordprocessingDrawing" xmlns:wp="http://schemas.openxmlformats.org/drawingml/2006/wordprocessingDrawing" xmlns:w10="urn:schemas-microsoft-com:office:word" xmlns:w="http://schemas.openxmlformats.org/wordprocessingml/2006/main" xmlns:w14="http://schemas.microsoft.com/office/word/2010/wordml" xmlns:w15="http://schemas.microsoft.com/office/word/2012/wordml" xmlns:w16cex="http://schemas.microsoft.com/office/word/2018/wordml/cex" xmlns:w16cid="http://schemas.microsoft.com/office/word/2016/wordml/cid" xmlns:w16="http://schemas.microsoft.com/office/word/2018/wordml" xmlns:w16du="http://schemas.microsoft.com/office/word/2023/wordml/word16du" xmlns:w16sdtdh="http://schemas.microsoft.com/office/word/2020/wordml/sdtdatahash" xmlns:w16se="http://schemas.microsoft.com/office/word/2015/wordml/symex" xmlns:wpg="http://schemas.microsoft.com/office/word/2010/wordprocessingGroup" xmlns:wpi="http://schemas.microsoft.com/office/word/2010/wordprocessingInk" xmlns:wne="http://schemas.microsoft.com/office/word/2006/wordml" xmlns:wps="http://schemas.microsoft.com/office/word/2010/wordprocessingShape" mc:Ignorable="w14 w15 w16se w16cid w16 w16cex w16sdtdh w16du wp14">
   <w:endnote w:type="separator" w:id="-1">
     <w:p>
       <w:r>
@@ -1857,13 +1805,13 @@
 </file>
 
 <file path=word/footer1.xml><?xml version="1.0" encoding="utf-8"?>
-<w:ftr xmlns:wpc="http://schemas.microsoft.com/office/word/2010/wordprocessingCanvas" xmlns:cx="http://schemas.microsoft.com/office/drawing/2014/chartex" xmlns:cx1="http://schemas.microsoft.com/office/drawing/2015/9/8/chartex" xmlns:cx2="http://schemas.microsoft.com/office/drawing/2015/10/21/chartex" xmlns:cx3="http://schemas.microsoft.com/office/drawing/2016/5/9/chartex" xmlns:cx4="http://schemas.microsoft.com/office/drawing/2016/5/10/chartex" xmlns:cx5="http://schemas.microsoft.com/office/drawing/2016/5/11/chartex" xmlns:cx6="http://schemas.microsoft.com/office/drawing/2016/5/12/chartex" xmlns:cx7="http://schemas.microsoft.com/office/drawing/2016/5/13/chartex" xmlns:cx8="http://schemas.microsoft.com/office/drawing/2016/5/14/chartex" xmlns:mc="http://schemas.openxmlformats.org/markup-compatibility/2006" xmlns:aink="http://schemas.microsoft.com/office/drawing/2016/ink" xmlns:am3d="http://schemas.microsoft.com/office/drawing/2017/model3d" xmlns:o="urn:schemas-microsoft-com:office:office" xmlns:oel="http://schemas.microsoft.com/office/2019/extlst" xmlns:r="http://schemas.openxmlformats.org/officeDocument/2006/relationships" xmlns:m="http://schemas.openxmlformats.org/officeDocument/2006/math" xmlns:v="urn:schemas-microsoft-com:vml" xmlns:wp14="http://schemas.microsoft.com/office/word/2010/wordprocessingDrawing" xmlns:wp="http://schemas.openxmlformats.org/drawingml/2006/wordprocessingDrawing" xmlns:w10="urn:schemas-microsoft-com:office:word" xmlns:w="http://schemas.openxmlformats.org/wordprocessingml/2006/main" xmlns:w14="http://schemas.microsoft.com/office/word/2010/wordml" xmlns:w15="http://schemas.microsoft.com/office/word/2012/wordml" xmlns:w16cex="http://schemas.microsoft.com/office/word/2018/wordml/cex" xmlns:w16cid="http://schemas.microsoft.com/office/word/2016/wordml/cid" xmlns:w16="http://schemas.microsoft.com/office/word/2018/wordml" xmlns:w16sdtdh="http://schemas.microsoft.com/office/word/2020/wordml/sdtdatahash" xmlns:w16se="http://schemas.microsoft.com/office/word/2015/wordml/symex" xmlns:wpg="http://schemas.microsoft.com/office/word/2010/wordprocessingGroup" xmlns:wpi="http://schemas.microsoft.com/office/word/2010/wordprocessingInk" xmlns:wne="http://schemas.microsoft.com/office/word/2006/wordml" xmlns:wps="http://schemas.microsoft.com/office/word/2010/wordprocessingShape" mc:Ignorable="w14 w15 w16se w16cid w16 w16cex w16sdtdh wp14">
+<w:ftr xmlns:wpc="http://schemas.microsoft.com/office/word/2010/wordprocessingCanvas" xmlns:cx="http://schemas.microsoft.com/office/drawing/2014/chartex" xmlns:cx1="http://schemas.microsoft.com/office/drawing/2015/9/8/chartex" xmlns:cx2="http://schemas.microsoft.com/office/drawing/2015/10/21/chartex" xmlns:cx3="http://schemas.microsoft.com/office/drawing/2016/5/9/chartex" xmlns:cx4="http://schemas.microsoft.com/office/drawing/2016/5/10/chartex" xmlns:cx5="http://schemas.microsoft.com/office/drawing/2016/5/11/chartex" xmlns:cx6="http://schemas.microsoft.com/office/drawing/2016/5/12/chartex" xmlns:cx7="http://schemas.microsoft.com/office/drawing/2016/5/13/chartex" xmlns:cx8="http://schemas.microsoft.com/office/drawing/2016/5/14/chartex" xmlns:mc="http://schemas.openxmlformats.org/markup-compatibility/2006" xmlns:aink="http://schemas.microsoft.com/office/drawing/2016/ink" xmlns:am3d="http://schemas.microsoft.com/office/drawing/2017/model3d" xmlns:o="urn:schemas-microsoft-com:office:office" xmlns:oel="http://schemas.microsoft.com/office/2019/extlst" xmlns:r="http://schemas.openxmlformats.org/officeDocument/2006/relationships" xmlns:m="http://schemas.openxmlformats.org/officeDocument/2006/math" xmlns:v="urn:schemas-microsoft-com:vml" xmlns:wp14="http://schemas.microsoft.com/office/word/2010/wordprocessingDrawing" xmlns:wp="http://schemas.openxmlformats.org/drawingml/2006/wordprocessingDrawing" xmlns:w10="urn:schemas-microsoft-com:office:word" xmlns:w="http://schemas.openxmlformats.org/wordprocessingml/2006/main" xmlns:w14="http://schemas.microsoft.com/office/word/2010/wordml" xmlns:w15="http://schemas.microsoft.com/office/word/2012/wordml" xmlns:w16cex="http://schemas.microsoft.com/office/word/2018/wordml/cex" xmlns:w16cid="http://schemas.microsoft.com/office/word/2016/wordml/cid" xmlns:w16="http://schemas.microsoft.com/office/word/2018/wordml" xmlns:w16du="http://schemas.microsoft.com/office/word/2023/wordml/word16du" xmlns:w16sdtdh="http://schemas.microsoft.com/office/word/2020/wordml/sdtdatahash" xmlns:w16se="http://schemas.microsoft.com/office/word/2015/wordml/symex" xmlns:wpg="http://schemas.microsoft.com/office/word/2010/wordprocessingGroup" xmlns:wpi="http://schemas.microsoft.com/office/word/2010/wordprocessingInk" xmlns:wne="http://schemas.microsoft.com/office/word/2006/wordml" xmlns:wps="http://schemas.microsoft.com/office/word/2010/wordprocessingShape" mc:Ignorable="w14 w15 w16se w16cid w16 w16cex w16sdtdh w16du wp14">
   <w:p/>
 </w:ftr>
 </file>
 
 <file path=word/footnotes.xml><?xml version="1.0" encoding="utf-8"?>
-<w:footnotes xmlns:wpc="http://schemas.microsoft.com/office/word/2010/wordprocessingCanvas" xmlns:cx="http://schemas.microsoft.com/office/drawing/2014/chartex" xmlns:cx1="http://schemas.microsoft.com/office/drawing/2015/9/8/chartex" xmlns:cx2="http://schemas.microsoft.com/office/drawing/2015/10/21/chartex" xmlns:cx3="http://schemas.microsoft.com/office/drawing/2016/5/9/chartex" xmlns:cx4="http://schemas.microsoft.com/office/drawing/2016/5/10/chartex" xmlns:cx5="http://schemas.microsoft.com/office/drawing/2016/5/11/chartex" xmlns:cx6="http://schemas.microsoft.com/office/drawing/2016/5/12/chartex" xmlns:cx7="http://schemas.microsoft.com/office/drawing/2016/5/13/chartex" xmlns:cx8="http://schemas.microsoft.com/office/drawing/2016/5/14/chartex" xmlns:mc="http://schemas.openxmlformats.org/markup-compatibility/2006" xmlns:aink="http://schemas.microsoft.com/office/drawing/2016/ink" xmlns:am3d="http://schemas.microsoft.com/office/drawing/2017/model3d" xmlns:o="urn:schemas-microsoft-com:office:office" xmlns:oel="http://schemas.microsoft.com/office/2019/extlst" xmlns:r="http://schemas.openxmlformats.org/officeDocument/2006/relationships" xmlns:m="http://schemas.openxmlformats.org/officeDocument/2006/math" xmlns:v="urn:schemas-microsoft-com:vml" xmlns:wp14="http://schemas.microsoft.com/office/word/2010/wordprocessingDrawing" xmlns:wp="http://schemas.openxmlformats.org/drawingml/2006/wordprocessingDrawing" xmlns:w10="urn:schemas-microsoft-com:office:word" xmlns:w="http://schemas.openxmlformats.org/wordprocessingml/2006/main" xmlns:w14="http://schemas.microsoft.com/office/word/2010/wordml" xmlns:w15="http://schemas.microsoft.com/office/word/2012/wordml" xmlns:w16cex="http://schemas.microsoft.com/office/word/2018/wordml/cex" xmlns:w16cid="http://schemas.microsoft.com/office/word/2016/wordml/cid" xmlns:w16="http://schemas.microsoft.com/office/word/2018/wordml" xmlns:w16sdtdh="http://schemas.microsoft.com/office/word/2020/wordml/sdtdatahash" xmlns:w16se="http://schemas.microsoft.com/office/word/2015/wordml/symex" xmlns:wpg="http://schemas.microsoft.com/office/word/2010/wordprocessingGroup" xmlns:wpi="http://schemas.microsoft.com/office/word/2010/wordprocessingInk" xmlns:wne="http://schemas.microsoft.com/office/word/2006/wordml" xmlns:wps="http://schemas.microsoft.com/office/word/2010/wordprocessingShape" mc:Ignorable="w14 w15 w16se w16cid w16 w16cex w16sdtdh wp14">
+<w:footnotes xmlns:wpc="http://schemas.microsoft.com/office/word/2010/wordprocessingCanvas" xmlns:cx="http://schemas.microsoft.com/office/drawing/2014/chartex" xmlns:cx1="http://schemas.microsoft.com/office/drawing/2015/9/8/chartex" xmlns:cx2="http://schemas.microsoft.com/office/drawing/2015/10/21/chartex" xmlns:cx3="http://schemas.microsoft.com/office/drawing/2016/5/9/chartex" xmlns:cx4="http://schemas.microsoft.com/office/drawing/2016/5/10/chartex" xmlns:cx5="http://schemas.microsoft.com/office/drawing/2016/5/11/chartex" xmlns:cx6="http://schemas.microsoft.com/office/drawing/2016/5/12/chartex" xmlns:cx7="http://schemas.microsoft.com/office/drawing/2016/5/13/chartex" xmlns:cx8="http://schemas.microsoft.com/office/drawing/2016/5/14/chartex" xmlns:mc="http://schemas.openxmlformats.org/markup-compatibility/2006" xmlns:aink="http://schemas.microsoft.com/office/drawing/2016/ink" xmlns:am3d="http://schemas.microsoft.com/office/drawing/2017/model3d" xmlns:o="urn:schemas-microsoft-com:office:office" xmlns:oel="http://schemas.microsoft.com/office/2019/extlst" xmlns:r="http://schemas.openxmlformats.org/officeDocument/2006/relationships" xmlns:m="http://schemas.openxmlformats.org/officeDocument/2006/math" xmlns:v="urn:schemas-microsoft-com:vml" xmlns:wp14="http://schemas.microsoft.com/office/word/2010/wordprocessingDrawing" xmlns:wp="http://schemas.openxmlformats.org/drawingml/2006/wordprocessingDrawing" xmlns:w10="urn:schemas-microsoft-com:office:word" xmlns:w="http://schemas.openxmlformats.org/wordprocessingml/2006/main" xmlns:w14="http://schemas.microsoft.com/office/word/2010/wordml" xmlns:w15="http://schemas.microsoft.com/office/word/2012/wordml" xmlns:w16cex="http://schemas.microsoft.com/office/word/2018/wordml/cex" xmlns:w16cid="http://schemas.microsoft.com/office/word/2016/wordml/cid" xmlns:w16="http://schemas.microsoft.com/office/word/2018/wordml" xmlns:w16du="http://schemas.microsoft.com/office/word/2023/wordml/word16du" xmlns:w16sdtdh="http://schemas.microsoft.com/office/word/2020/wordml/sdtdatahash" xmlns:w16se="http://schemas.microsoft.com/office/word/2015/wordml/symex" xmlns:wpg="http://schemas.microsoft.com/office/word/2010/wordprocessingGroup" xmlns:wpi="http://schemas.microsoft.com/office/word/2010/wordprocessingInk" xmlns:wne="http://schemas.microsoft.com/office/word/2006/wordml" xmlns:wps="http://schemas.microsoft.com/office/word/2010/wordprocessingShape" mc:Ignorable="w14 w15 w16se w16cid w16 w16cex w16sdtdh w16du wp14">
   <w:footnote w:type="separator" w:id="-1">
     <w:p>
       <w:r>
@@ -1882,13 +1830,13 @@
 </file>
 
 <file path=word/header1.xml><?xml version="1.0" encoding="utf-8"?>
-<w:hdr xmlns:wpc="http://schemas.microsoft.com/office/word/2010/wordprocessingCanvas" xmlns:cx="http://schemas.microsoft.com/office/drawing/2014/chartex" xmlns:cx1="http://schemas.microsoft.com/office/drawing/2015/9/8/chartex" xmlns:cx2="http://schemas.microsoft.com/office/drawing/2015/10/21/chartex" xmlns:cx3="http://schemas.microsoft.com/office/drawing/2016/5/9/chartex" xmlns:cx4="http://schemas.microsoft.com/office/drawing/2016/5/10/chartex" xmlns:cx5="http://schemas.microsoft.com/office/drawing/2016/5/11/chartex" xmlns:cx6="http://schemas.microsoft.com/office/drawing/2016/5/12/chartex" xmlns:cx7="http://schemas.microsoft.com/office/drawing/2016/5/13/chartex" xmlns:cx8="http://schemas.microsoft.com/office/drawing/2016/5/14/chartex" xmlns:mc="http://schemas.openxmlformats.org/markup-compatibility/2006" xmlns:aink="http://schemas.microsoft.com/office/drawing/2016/ink" xmlns:am3d="http://schemas.microsoft.com/office/drawing/2017/model3d" xmlns:o="urn:schemas-microsoft-com:office:office" xmlns:oel="http://schemas.microsoft.com/office/2019/extlst" xmlns:r="http://schemas.openxmlformats.org/officeDocument/2006/relationships" xmlns:m="http://schemas.openxmlformats.org/officeDocument/2006/math" xmlns:v="urn:schemas-microsoft-com:vml" xmlns:wp14="http://schemas.microsoft.com/office/word/2010/wordprocessingDrawing" xmlns:wp="http://schemas.openxmlformats.org/drawingml/2006/wordprocessingDrawing" xmlns:w10="urn:schemas-microsoft-com:office:word" xmlns:w="http://schemas.openxmlformats.org/wordprocessingml/2006/main" xmlns:w14="http://schemas.microsoft.com/office/word/2010/wordml" xmlns:w15="http://schemas.microsoft.com/office/word/2012/wordml" xmlns:w16cex="http://schemas.microsoft.com/office/word/2018/wordml/cex" xmlns:w16cid="http://schemas.microsoft.com/office/word/2016/wordml/cid" xmlns:w16="http://schemas.microsoft.com/office/word/2018/wordml" xmlns:w16sdtdh="http://schemas.microsoft.com/office/word/2020/wordml/sdtdatahash" xmlns:w16se="http://schemas.microsoft.com/office/word/2015/wordml/symex" xmlns:wpg="http://schemas.microsoft.com/office/word/2010/wordprocessingGroup" xmlns:wpi="http://schemas.microsoft.com/office/word/2010/wordprocessingInk" xmlns:wne="http://schemas.microsoft.com/office/word/2006/wordml" xmlns:wps="http://schemas.microsoft.com/office/word/2010/wordprocessingShape" mc:Ignorable="w14 w15 w16se w16cid w16 w16cex w16sdtdh wp14">
+<w:hdr xmlns:wpc="http://schemas.microsoft.com/office/word/2010/wordprocessingCanvas" xmlns:cx="http://schemas.microsoft.com/office/drawing/2014/chartex" xmlns:cx1="http://schemas.microsoft.com/office/drawing/2015/9/8/chartex" xmlns:cx2="http://schemas.microsoft.com/office/drawing/2015/10/21/chartex" xmlns:cx3="http://schemas.microsoft.com/office/drawing/2016/5/9/chartex" xmlns:cx4="http://schemas.microsoft.com/office/drawing/2016/5/10/chartex" xmlns:cx5="http://schemas.microsoft.com/office/drawing/2016/5/11/chartex" xmlns:cx6="http://schemas.microsoft.com/office/drawing/2016/5/12/chartex" xmlns:cx7="http://schemas.microsoft.com/office/drawing/2016/5/13/chartex" xmlns:cx8="http://schemas.microsoft.com/office/drawing/2016/5/14/chartex" xmlns:mc="http://schemas.openxmlformats.org/markup-compatibility/2006" xmlns:aink="http://schemas.microsoft.com/office/drawing/2016/ink" xmlns:am3d="http://schemas.microsoft.com/office/drawing/2017/model3d" xmlns:o="urn:schemas-microsoft-com:office:office" xmlns:oel="http://schemas.microsoft.com/office/2019/extlst" xmlns:r="http://schemas.openxmlformats.org/officeDocument/2006/relationships" xmlns:m="http://schemas.openxmlformats.org/officeDocument/2006/math" xmlns:v="urn:schemas-microsoft-com:vml" xmlns:wp14="http://schemas.microsoft.com/office/word/2010/wordprocessingDrawing" xmlns:wp="http://schemas.openxmlformats.org/drawingml/2006/wordprocessingDrawing" xmlns:w10="urn:schemas-microsoft-com:office:word" xmlns:w="http://schemas.openxmlformats.org/wordprocessingml/2006/main" xmlns:w14="http://schemas.microsoft.com/office/word/2010/wordml" xmlns:w15="http://schemas.microsoft.com/office/word/2012/wordml" xmlns:w16cex="http://schemas.microsoft.com/office/word/2018/wordml/cex" xmlns:w16cid="http://schemas.microsoft.com/office/word/2016/wordml/cid" xmlns:w16="http://schemas.microsoft.com/office/word/2018/wordml" xmlns:w16du="http://schemas.microsoft.com/office/word/2023/wordml/word16du" xmlns:w16sdtdh="http://schemas.microsoft.com/office/word/2020/wordml/sdtdatahash" xmlns:w16se="http://schemas.microsoft.com/office/word/2015/wordml/symex" xmlns:wpg="http://schemas.microsoft.com/office/word/2010/wordprocessingGroup" xmlns:wpi="http://schemas.microsoft.com/office/word/2010/wordprocessingInk" xmlns:wne="http://schemas.microsoft.com/office/word/2006/wordml" xmlns:wps="http://schemas.microsoft.com/office/word/2010/wordprocessingShape" mc:Ignorable="w14 w15 w16se w16cid w16 w16cex w16sdtdh w16du wp14">
   <w:p/>
 </w:hdr>
 </file>
 
 <file path=word/numbering.xml><?xml version="1.0" encoding="utf-8"?>
-<w:numbering xmlns:wpc="http://schemas.microsoft.com/office/word/2010/wordprocessingCanvas" xmlns:cx="http://schemas.microsoft.com/office/drawing/2014/chartex" xmlns:cx1="http://schemas.microsoft.com/office/drawing/2015/9/8/chartex" xmlns:cx2="http://schemas.microsoft.com/office/drawing/2015/10/21/chartex" xmlns:cx3="http://schemas.microsoft.com/office/drawing/2016/5/9/chartex" xmlns:cx4="http://schemas.microsoft.com/office/drawing/2016/5/10/chartex" xmlns:cx5="http://schemas.microsoft.com/office/drawing/2016/5/11/chartex" xmlns:cx6="http://schemas.microsoft.com/office/drawing/2016/5/12/chartex" xmlns:cx7="http://schemas.microsoft.com/office/drawing/2016/5/13/chartex" xmlns:cx8="http://schemas.microsoft.com/office/drawing/2016/5/14/chartex" xmlns:mc="http://schemas.openxmlformats.org/markup-compatibility/2006" xmlns:aink="http://schemas.microsoft.com/office/drawing/2016/ink" xmlns:am3d="http://schemas.microsoft.com/office/drawing/2017/model3d" xmlns:o="urn:schemas-microsoft-com:office:office" xmlns:oel="http://schemas.microsoft.com/office/2019/extlst" xmlns:r="http://schemas.openxmlformats.org/officeDocument/2006/relationships" xmlns:m="http://schemas.openxmlformats.org/officeDocument/2006/math" xmlns:v="urn:schemas-microsoft-com:vml" xmlns:wp14="http://schemas.microsoft.com/office/word/2010/wordprocessingDrawing" xmlns:wp="http://schemas.openxmlformats.org/drawingml/2006/wordprocessingDrawing" xmlns:w10="urn:schemas-microsoft-com:office:word" xmlns:w="http://schemas.openxmlformats.org/wordprocessingml/2006/main" xmlns:w14="http://schemas.microsoft.com/office/word/2010/wordml" xmlns:w15="http://schemas.microsoft.com/office/word/2012/wordml" xmlns:w16cex="http://schemas.microsoft.com/office/word/2018/wordml/cex" xmlns:w16cid="http://schemas.microsoft.com/office/word/2016/wordml/cid" xmlns:w16="http://schemas.microsoft.com/office/word/2018/wordml" xmlns:w16sdtdh="http://schemas.microsoft.com/office/word/2020/wordml/sdtdatahash" xmlns:w16se="http://schemas.microsoft.com/office/word/2015/wordml/symex" xmlns:wpg="http://schemas.microsoft.com/office/word/2010/wordprocessingGroup" xmlns:wpi="http://schemas.microsoft.com/office/word/2010/wordprocessingInk" xmlns:wne="http://schemas.microsoft.com/office/word/2006/wordml" xmlns:wps="http://schemas.microsoft.com/office/word/2010/wordprocessingShape" mc:Ignorable="w14 w15 w16se w16cid w16 w16cex w16sdtdh wp14">
+<w:numbering xmlns:wpc="http://schemas.microsoft.com/office/word/2010/wordprocessingCanvas" xmlns:cx="http://schemas.microsoft.com/office/drawing/2014/chartex" xmlns:cx1="http://schemas.microsoft.com/office/drawing/2015/9/8/chartex" xmlns:cx2="http://schemas.microsoft.com/office/drawing/2015/10/21/chartex" xmlns:cx3="http://schemas.microsoft.com/office/drawing/2016/5/9/chartex" xmlns:cx4="http://schemas.microsoft.com/office/drawing/2016/5/10/chartex" xmlns:cx5="http://schemas.microsoft.com/office/drawing/2016/5/11/chartex" xmlns:cx6="http://schemas.microsoft.com/office/drawing/2016/5/12/chartex" xmlns:cx7="http://schemas.microsoft.com/office/drawing/2016/5/13/chartex" xmlns:cx8="http://schemas.microsoft.com/office/drawing/2016/5/14/chartex" xmlns:mc="http://schemas.openxmlformats.org/markup-compatibility/2006" xmlns:aink="http://schemas.microsoft.com/office/drawing/2016/ink" xmlns:am3d="http://schemas.microsoft.com/office/drawing/2017/model3d" xmlns:o="urn:schemas-microsoft-com:office:office" xmlns:oel="http://schemas.microsoft.com/office/2019/extlst" xmlns:r="http://schemas.openxmlformats.org/officeDocument/2006/relationships" xmlns:m="http://schemas.openxmlformats.org/officeDocument/2006/math" xmlns:v="urn:schemas-microsoft-com:vml" xmlns:wp14="http://schemas.microsoft.com/office/word/2010/wordprocessingDrawing" xmlns:wp="http://schemas.openxmlformats.org/drawingml/2006/wordprocessingDrawing" xmlns:w10="urn:schemas-microsoft-com:office:word" xmlns:w="http://schemas.openxmlformats.org/wordprocessingml/2006/main" xmlns:w14="http://schemas.microsoft.com/office/word/2010/wordml" xmlns:w15="http://schemas.microsoft.com/office/word/2012/wordml" xmlns:w16cex="http://schemas.microsoft.com/office/word/2018/wordml/cex" xmlns:w16cid="http://schemas.microsoft.com/office/word/2016/wordml/cid" xmlns:w16="http://schemas.microsoft.com/office/word/2018/wordml" xmlns:w16du="http://schemas.microsoft.com/office/word/2023/wordml/word16du" xmlns:w16sdtdh="http://schemas.microsoft.com/office/word/2020/wordml/sdtdatahash" xmlns:w16se="http://schemas.microsoft.com/office/word/2015/wordml/symex" xmlns:wpg="http://schemas.microsoft.com/office/word/2010/wordprocessingGroup" xmlns:wpi="http://schemas.microsoft.com/office/word/2010/wordprocessingInk" xmlns:wne="http://schemas.microsoft.com/office/word/2006/wordml" xmlns:wps="http://schemas.microsoft.com/office/word/2010/wordprocessingShape" mc:Ignorable="w14 w15 w16se w16cid w16 w16cex w16sdtdh w16du wp14">
   <w:abstractNum w:abstractNumId="0" w15:restartNumberingAfterBreak="0">
     <w:nsid w:val="013E5858"/>
     <w:multiLevelType w:val="hybridMultilevel"/>
@@ -2089,18 +2037,130 @@
     </w:lvl>
   </w:abstractNum>
   <w:abstractNum w:abstractNumId="2" w15:restartNumberingAfterBreak="0">
+    <w:nsid w:val="0C2F1AB8"/>
+    <w:multiLevelType w:val="hybridMultilevel"/>
+    <w:tmpl w:val="FA066D14"/>
+    <w:lvl w:ilvl="0" w:tplc="5DFE4C42">
+      <w:numFmt w:val="bullet"/>
+      <w:lvlText w:val=""/>
+      <w:lvlJc w:val="left"/>
+      <w:pPr>
+        <w:ind w:left="720" w:hanging="360"/>
+      </w:pPr>
+      <w:rPr>
+        <w:rFonts w:ascii="Symbol" w:eastAsia="Helvetica Neue" w:hAnsi="Symbol" w:cs="Helvetica Neue" w:hint="default"/>
+      </w:rPr>
+    </w:lvl>
+    <w:lvl w:ilvl="1" w:tplc="04090003" w:tentative="1">
+      <w:start w:val="1"/>
+      <w:numFmt w:val="bullet"/>
+      <w:lvlText w:val="o"/>
+      <w:lvlJc w:val="left"/>
+      <w:pPr>
+        <w:ind w:left="1440" w:hanging="360"/>
+      </w:pPr>
+      <w:rPr>
+        <w:rFonts w:ascii="Courier New" w:hAnsi="Courier New" w:cs="Courier New" w:hint="default"/>
+      </w:rPr>
+    </w:lvl>
+    <w:lvl w:ilvl="2" w:tplc="04090005" w:tentative="1">
+      <w:start w:val="1"/>
+      <w:numFmt w:val="bullet"/>
+      <w:lvlText w:val=""/>
+      <w:lvlJc w:val="left"/>
+      <w:pPr>
+        <w:ind w:left="2160" w:hanging="360"/>
+      </w:pPr>
+      <w:rPr>
+        <w:rFonts w:ascii="Wingdings" w:hAnsi="Wingdings" w:hint="default"/>
+      </w:rPr>
+    </w:lvl>
+    <w:lvl w:ilvl="3" w:tplc="04090001" w:tentative="1">
+      <w:start w:val="1"/>
+      <w:numFmt w:val="bullet"/>
+      <w:lvlText w:val=""/>
+      <w:lvlJc w:val="left"/>
+      <w:pPr>
+        <w:ind w:left="2880" w:hanging="360"/>
+      </w:pPr>
+      <w:rPr>
+        <w:rFonts w:ascii="Symbol" w:hAnsi="Symbol" w:hint="default"/>
+      </w:rPr>
+    </w:lvl>
+    <w:lvl w:ilvl="4" w:tplc="04090003" w:tentative="1">
+      <w:start w:val="1"/>
+      <w:numFmt w:val="bullet"/>
+      <w:lvlText w:val="o"/>
+      <w:lvlJc w:val="left"/>
+      <w:pPr>
+        <w:ind w:left="3600" w:hanging="360"/>
+      </w:pPr>
+      <w:rPr>
+        <w:rFonts w:ascii="Courier New" w:hAnsi="Courier New" w:cs="Courier New" w:hint="default"/>
+      </w:rPr>
+    </w:lvl>
+    <w:lvl w:ilvl="5" w:tplc="04090005" w:tentative="1">
+      <w:start w:val="1"/>
+      <w:numFmt w:val="bullet"/>
+      <w:lvlText w:val=""/>
+      <w:lvlJc w:val="left"/>
+      <w:pPr>
+        <w:ind w:left="4320" w:hanging="360"/>
+      </w:pPr>
+      <w:rPr>
+        <w:rFonts w:ascii="Wingdings" w:hAnsi="Wingdings" w:hint="default"/>
+      </w:rPr>
+    </w:lvl>
+    <w:lvl w:ilvl="6" w:tplc="04090001" w:tentative="1">
+      <w:start w:val="1"/>
+      <w:numFmt w:val="bullet"/>
+      <w:lvlText w:val=""/>
+      <w:lvlJc w:val="left"/>
+      <w:pPr>
+        <w:ind w:left="5040" w:hanging="360"/>
+      </w:pPr>
+      <w:rPr>
+        <w:rFonts w:ascii="Symbol" w:hAnsi="Symbol" w:hint="default"/>
+      </w:rPr>
+    </w:lvl>
+    <w:lvl w:ilvl="7" w:tplc="04090003" w:tentative="1">
+      <w:start w:val="1"/>
+      <w:numFmt w:val="bullet"/>
+      <w:lvlText w:val="o"/>
+      <w:lvlJc w:val="left"/>
+      <w:pPr>
+        <w:ind w:left="5760" w:hanging="360"/>
+      </w:pPr>
+      <w:rPr>
+        <w:rFonts w:ascii="Courier New" w:hAnsi="Courier New" w:cs="Courier New" w:hint="default"/>
+      </w:rPr>
+    </w:lvl>
+    <w:lvl w:ilvl="8" w:tplc="04090005" w:tentative="1">
+      <w:start w:val="1"/>
+      <w:numFmt w:val="bullet"/>
+      <w:lvlText w:val=""/>
+      <w:lvlJc w:val="left"/>
+      <w:pPr>
+        <w:ind w:left="6480" w:hanging="360"/>
+      </w:pPr>
+      <w:rPr>
+        <w:rFonts w:ascii="Wingdings" w:hAnsi="Wingdings" w:hint="default"/>
+      </w:rPr>
+    </w:lvl>
+  </w:abstractNum>
+  <w:abstractNum w:abstractNumId="3" w15:restartNumberingAfterBreak="0">
     <w:nsid w:val="1B2164A2"/>
     <w:multiLevelType w:val="hybridMultilevel"/>
     <w:tmpl w:val="4B42821A"/>
     <w:numStyleLink w:val="BulletBig"/>
   </w:abstractNum>
-  <w:abstractNum w:abstractNumId="3" w15:restartNumberingAfterBreak="0">
+  <w:abstractNum w:abstractNumId="4" w15:restartNumberingAfterBreak="0">
     <w:nsid w:val="3E1020B7"/>
     <w:multiLevelType w:val="hybridMultilevel"/>
     <w:tmpl w:val="E3BC3BBE"/>
     <w:numStyleLink w:val="Bullet"/>
   </w:abstractNum>
-  <w:abstractNum w:abstractNumId="4" w15:restartNumberingAfterBreak="0">
+  <w:abstractNum w:abstractNumId="5" w15:restartNumberingAfterBreak="0">
     <w:nsid w:val="5B5F1638"/>
     <w:multiLevelType w:val="hybridMultilevel"/>
     <w:tmpl w:val="4B42821A"/>
@@ -2376,7 +2436,7 @@
       </w:rPr>
     </w:lvl>
   </w:abstractNum>
-  <w:abstractNum w:abstractNumId="5" w15:restartNumberingAfterBreak="0">
+  <w:abstractNum w:abstractNumId="6" w15:restartNumberingAfterBreak="0">
     <w:nsid w:val="7CC4513A"/>
     <w:multiLevelType w:val="hybridMultilevel"/>
     <w:tmpl w:val="E3BC3BBE"/>
@@ -2635,21 +2695,21 @@
     </w:lvl>
   </w:abstractNum>
   <w:num w:numId="1" w16cid:durableId="1720351718">
+    <w:abstractNumId w:val="6"/>
+  </w:num>
+  <w:num w:numId="2" w16cid:durableId="1294946698">
+    <w:abstractNumId w:val="4"/>
+  </w:num>
+  <w:num w:numId="3" w16cid:durableId="1338339668">
     <w:abstractNumId w:val="5"/>
   </w:num>
-  <w:num w:numId="2" w16cid:durableId="1294946698">
+  <w:num w:numId="4" w16cid:durableId="1561331282">
     <w:abstractNumId w:val="3"/>
   </w:num>
-  <w:num w:numId="3" w16cid:durableId="1338339668">
+  <w:num w:numId="5" w16cid:durableId="1067915513">
     <w:abstractNumId w:val="4"/>
-  </w:num>
-  <w:num w:numId="4" w16cid:durableId="1561331282">
-    <w:abstractNumId w:val="2"/>
-  </w:num>
-  <w:num w:numId="5" w16cid:durableId="1067915513">
-    <w:abstractNumId w:val="3"/>
     <w:lvlOverride w:ilvl="0">
-      <w:lvl w:ilvl="0" w:tplc="2CEA7554">
+      <w:lvl w:ilvl="0" w:tplc="6CF42AEA">
         <w:start w:val="1"/>
         <w:numFmt w:val="bullet"/>
         <w:lvlText w:val="•"/>
@@ -2676,7 +2736,7 @@
       </w:lvl>
     </w:lvlOverride>
     <w:lvlOverride w:ilvl="1">
-      <w:lvl w:ilvl="1" w:tplc="959894E6">
+      <w:lvl w:ilvl="1" w:tplc="B1D4B1E6">
         <w:start w:val="1"/>
         <w:numFmt w:val="bullet"/>
         <w:lvlText w:val="•"/>
@@ -2703,7 +2763,7 @@
       </w:lvl>
     </w:lvlOverride>
     <w:lvlOverride w:ilvl="2">
-      <w:lvl w:ilvl="2" w:tplc="CFAA49BE">
+      <w:lvl w:ilvl="2" w:tplc="31F03EC4">
         <w:start w:val="1"/>
         <w:numFmt w:val="bullet"/>
         <w:lvlText w:val="•"/>
@@ -2730,7 +2790,7 @@
       </w:lvl>
     </w:lvlOverride>
     <w:lvlOverride w:ilvl="3">
-      <w:lvl w:ilvl="3" w:tplc="82823588">
+      <w:lvl w:ilvl="3" w:tplc="6C34723C">
         <w:start w:val="1"/>
         <w:numFmt w:val="bullet"/>
         <w:lvlText w:val="•"/>
@@ -2757,7 +2817,7 @@
       </w:lvl>
     </w:lvlOverride>
     <w:lvlOverride w:ilvl="4">
-      <w:lvl w:ilvl="4" w:tplc="F7C4E286">
+      <w:lvl w:ilvl="4" w:tplc="CC9611FC">
         <w:start w:val="1"/>
         <w:numFmt w:val="bullet"/>
         <w:lvlText w:val="•"/>
@@ -2784,7 +2844,7 @@
       </w:lvl>
     </w:lvlOverride>
     <w:lvlOverride w:ilvl="5">
-      <w:lvl w:ilvl="5" w:tplc="EA5C5834">
+      <w:lvl w:ilvl="5" w:tplc="308848B8">
         <w:start w:val="1"/>
         <w:numFmt w:val="bullet"/>
         <w:lvlText w:val="•"/>
@@ -2811,7 +2871,7 @@
       </w:lvl>
     </w:lvlOverride>
     <w:lvlOverride w:ilvl="6">
-      <w:lvl w:ilvl="6" w:tplc="137CCCEE">
+      <w:lvl w:ilvl="6" w:tplc="48267132">
         <w:start w:val="1"/>
         <w:numFmt w:val="bullet"/>
         <w:lvlText w:val="•"/>
@@ -2838,7 +2898,7 @@
       </w:lvl>
     </w:lvlOverride>
     <w:lvlOverride w:ilvl="7">
-      <w:lvl w:ilvl="7" w:tplc="42646284">
+      <w:lvl w:ilvl="7" w:tplc="0D2EED8A">
         <w:start w:val="1"/>
         <w:numFmt w:val="bullet"/>
         <w:lvlText w:val="•"/>
@@ -2865,7 +2925,7 @@
       </w:lvl>
     </w:lvlOverride>
     <w:lvlOverride w:ilvl="8">
-      <w:lvl w:ilvl="8" w:tplc="E0EE8FCC">
+      <w:lvl w:ilvl="8" w:tplc="699A934A">
         <w:start w:val="1"/>
         <w:numFmt w:val="bullet"/>
         <w:lvlText w:val="•"/>
@@ -2898,11 +2958,14 @@
   <w:num w:numId="7" w16cid:durableId="1120076125">
     <w:abstractNumId w:val="1"/>
   </w:num>
+  <w:num w:numId="8" w16cid:durableId="1772508336">
+    <w:abstractNumId w:val="2"/>
+  </w:num>
 </w:numbering>
 </file>
 
 <file path=word/styles.xml><?xml version="1.0" encoding="utf-8"?>
-<w:styles xmlns:mc="http://schemas.openxmlformats.org/markup-compatibility/2006" xmlns:r="http://schemas.openxmlformats.org/officeDocument/2006/relationships" xmlns:w="http://schemas.openxmlformats.org/wordprocessingml/2006/main" xmlns:w14="http://schemas.microsoft.com/office/word/2010/wordml" xmlns:w15="http://schemas.microsoft.com/office/word/2012/wordml" xmlns:w16cex="http://schemas.microsoft.com/office/word/2018/wordml/cex" xmlns:w16cid="http://schemas.microsoft.com/office/word/2016/wordml/cid" xmlns:w16="http://schemas.microsoft.com/office/word/2018/wordml" xmlns:w16sdtdh="http://schemas.microsoft.com/office/word/2020/wordml/sdtdatahash" xmlns:w16se="http://schemas.microsoft.com/office/word/2015/wordml/symex" mc:Ignorable="w14 w15 w16se w16cid w16 w16cex w16sdtdh">
+<w:styles xmlns:mc="http://schemas.openxmlformats.org/markup-compatibility/2006" xmlns:r="http://schemas.openxmlformats.org/officeDocument/2006/relationships" xmlns:w="http://schemas.openxmlformats.org/wordprocessingml/2006/main" xmlns:w14="http://schemas.microsoft.com/office/word/2010/wordml" xmlns:w15="http://schemas.microsoft.com/office/word/2012/wordml" xmlns:w16cex="http://schemas.microsoft.com/office/word/2018/wordml/cex" xmlns:w16cid="http://schemas.microsoft.com/office/word/2016/wordml/cid" xmlns:w16="http://schemas.microsoft.com/office/word/2018/wordml" xmlns:w16du="http://schemas.microsoft.com/office/word/2023/wordml/word16du" xmlns:w16sdtdh="http://schemas.microsoft.com/office/word/2020/wordml/sdtdatahash" xmlns:w16se="http://schemas.microsoft.com/office/word/2015/wordml/symex" mc:Ignorable="w14 w15 w16se w16cid w16 w16cex w16sdtdh w16du">
   <w:docDefaults>
     <w:rPrDefault>
       <w:rPr>

</xml_diff>

<commit_message>
Add LSV'24 to CV
</commit_message>
<xml_diff>
--- a/Media/Assets/CV_Word.docx
+++ b/Media/Assets/CV_Word.docx
@@ -149,8 +149,13 @@
       <w:r>
         <w:t xml:space="preserve"> </w:t>
       </w:r>
-      <w:r>
-        <w:t>SuperComputing conference -- for 2024 we will be in Atlanta, GA</w:t>
+      <w:proofErr w:type="spellStart"/>
+      <w:r>
+        <w:t>SuperComputing</w:t>
+      </w:r>
+      <w:proofErr w:type="spellEnd"/>
+      <w:r>
+        <w:t xml:space="preserve"> conference -- for 2024 we will be in Atlanta, GA</w:t>
       </w:r>
       <w:r>
         <w:t>.</w:t>
@@ -162,7 +167,15 @@
         <w:t xml:space="preserve"> </w:t>
       </w:r>
       <w:r>
-        <w:t>Computer Scientist in the DoE National Labs and to continue serving the community at SuperComputing and other</w:t>
+        <w:t xml:space="preserve">Computer Scientist in the DoE National Labs and to continue serving the community at </w:t>
+      </w:r>
+      <w:proofErr w:type="spellStart"/>
+      <w:r>
+        <w:t>SuperComputing</w:t>
+      </w:r>
+      <w:proofErr w:type="spellEnd"/>
+      <w:r>
+        <w:t xml:space="preserve"> and other</w:t>
       </w:r>
       <w:r>
         <w:t xml:space="preserve"> </w:t>
@@ -230,10 +243,7 @@
         <w:t xml:space="preserve">prove to be both </w:t>
       </w:r>
       <w:r>
-        <w:t>difficult and costly</w:t>
-      </w:r>
-      <w:r>
-        <w:t xml:space="preserve"> </w:t>
+        <w:t xml:space="preserve">difficult and costly </w:t>
       </w:r>
       <w:r>
         <w:t xml:space="preserve">at large scale </w:t>
@@ -413,7 +423,23 @@
         </w:tabs>
       </w:pPr>
       <w:r>
-        <w:t>[In Preparation] Thomas Randall, Guoxi Liu, Federico Iuricich and Rong Ge, “Vector-Parallel Tetrahedral Mesh Processing</w:t>
+        <w:t xml:space="preserve">[In Preparation] Thomas Randall, </w:t>
+      </w:r>
+      <w:proofErr w:type="spellStart"/>
+      <w:r>
+        <w:t>Guoxi</w:t>
+      </w:r>
+      <w:proofErr w:type="spellEnd"/>
+      <w:r>
+        <w:t xml:space="preserve"> Liu, Federico </w:t>
+      </w:r>
+      <w:proofErr w:type="spellStart"/>
+      <w:r>
+        <w:t>Iuricich</w:t>
+      </w:r>
+      <w:proofErr w:type="spellEnd"/>
+      <w:r>
+        <w:t xml:space="preserve"> and Rong Ge, “Vector-Parallel Tetrahedral Mesh Processing</w:t>
       </w:r>
       <w:r>
         <w:t xml:space="preserve"> for GPUs</w:t>
@@ -430,7 +456,23 @@
         </w:tabs>
       </w:pPr>
       <w:r>
-        <w:t>[In Preparation] Thomas Randall, Arafat Hossain, Akash Dutta, Xingfu Wu, Ali Jannesari and Rong Ge, “Combining Generative Transfer Autotuning with Performance Modeling”</w:t>
+        <w:t xml:space="preserve">[In Preparation] Thomas Randall, Arafat Hossain, Akash Dutta, </w:t>
+      </w:r>
+      <w:proofErr w:type="spellStart"/>
+      <w:r>
+        <w:t>Xingfu</w:t>
+      </w:r>
+      <w:proofErr w:type="spellEnd"/>
+      <w:r>
+        <w:t xml:space="preserve"> Wu, Ali </w:t>
+      </w:r>
+      <w:proofErr w:type="spellStart"/>
+      <w:r>
+        <w:t>Jannesari</w:t>
+      </w:r>
+      <w:proofErr w:type="spellEnd"/>
+      <w:r>
+        <w:t xml:space="preserve"> and Rong Ge, “Combining Generative Transfer Autotuning with Performance Modeling”</w:t>
       </w:r>
     </w:p>
     <w:p>
@@ -452,7 +494,23 @@
         </w:tabs>
       </w:pPr>
       <w:r>
-        <w:t>[ICS’23] Thomas Randall, Jaehoon Koo, Brice Videau, Michael Kruse, Xingfu Wu, Paul Hovland, Mary</w:t>
+        <w:t xml:space="preserve">[ICS’23] Thomas Randall, </w:t>
+      </w:r>
+      <w:proofErr w:type="spellStart"/>
+      <w:r>
+        <w:t>Jaehoon</w:t>
+      </w:r>
+      <w:proofErr w:type="spellEnd"/>
+      <w:r>
+        <w:t xml:space="preserve"> Koo, Brice Videau, Michael Kruse, </w:t>
+      </w:r>
+      <w:proofErr w:type="spellStart"/>
+      <w:r>
+        <w:t>Xingfu</w:t>
+      </w:r>
+      <w:proofErr w:type="spellEnd"/>
+      <w:r>
+        <w:t xml:space="preserve"> Wu, Paul Hovland, Mary</w:t>
       </w:r>
     </w:p>
     <w:p>
@@ -466,7 +524,15 @@
         </w:rPr>
       </w:pPr>
       <w:r>
-        <w:t>Hall, Rong Ge and Prasanna Balaprakash, “</w:t>
+        <w:t xml:space="preserve">Hall, Rong Ge and Prasanna </w:t>
+      </w:r>
+      <w:proofErr w:type="spellStart"/>
+      <w:r>
+        <w:t>Balaprakash</w:t>
+      </w:r>
+      <w:proofErr w:type="spellEnd"/>
+      <w:r>
+        <w:t>, “</w:t>
       </w:r>
       <w:r>
         <w:fldChar w:fldCharType="begin"/>
@@ -1080,6 +1146,142 @@
         <w:rPr>
           <w:rFonts w:ascii="Arial" w:hAnsi="Arial"/>
         </w:rPr>
+        <w:t>Lead Student Volunteer, Guided Interest Group Leader</w:t>
+      </w:r>
+      <w:r>
+        <w:rPr>
+          <w:rFonts w:ascii="Arial" w:hAnsi="Arial"/>
+        </w:rPr>
+        <w:tab/>
+        <w:t>Fall 2024</w:t>
+      </w:r>
+    </w:p>
+    <w:p>
+      <w:pPr>
+        <w:pStyle w:val="TableStyle2"/>
+        <w:tabs>
+          <w:tab w:val="right" w:pos="9360"/>
+        </w:tabs>
+        <w:rPr>
+          <w:rFonts w:ascii="Arial" w:hAnsi="Arial"/>
+        </w:rPr>
+      </w:pPr>
+      <w:r>
+        <w:rPr>
+          <w:rFonts w:ascii="Arial" w:hAnsi="Arial"/>
+        </w:rPr>
+        <w:t>SuperComputing’24</w:t>
+      </w:r>
+      <w:r>
+        <w:rPr>
+          <w:rFonts w:ascii="Arial" w:hAnsi="Arial"/>
+        </w:rPr>
+        <w:tab/>
+        <w:t>Atlanta, GA</w:t>
+      </w:r>
+    </w:p>
+    <w:p>
+      <w:pPr>
+        <w:pStyle w:val="TableStyle2"/>
+        <w:numPr>
+          <w:ilvl w:val="0"/>
+          <w:numId w:val="9"/>
+        </w:numPr>
+        <w:tabs>
+          <w:tab w:val="right" w:pos="9360"/>
+        </w:tabs>
+        <w:rPr>
+          <w:rFonts w:ascii="Arial" w:hAnsi="Arial"/>
+        </w:rPr>
+      </w:pPr>
+      <w:r>
+        <w:rPr>
+          <w:rFonts w:ascii="Arial" w:hAnsi="Arial"/>
+        </w:rPr>
+        <w:t>Jointly organized Reproducibility efforts with conference committee members</w:t>
+      </w:r>
+    </w:p>
+    <w:p>
+      <w:pPr>
+        <w:pStyle w:val="TableStyle2"/>
+        <w:numPr>
+          <w:ilvl w:val="0"/>
+          <w:numId w:val="9"/>
+        </w:numPr>
+        <w:tabs>
+          <w:tab w:val="right" w:pos="9360"/>
+        </w:tabs>
+        <w:rPr>
+          <w:rFonts w:ascii="Arial" w:hAnsi="Arial"/>
+        </w:rPr>
+      </w:pPr>
+      <w:r>
+        <w:rPr>
+          <w:rFonts w:ascii="Arial" w:hAnsi="Arial"/>
+        </w:rPr>
+        <w:t>Managed student volunteers to facilitate conference events</w:t>
+      </w:r>
+    </w:p>
+    <w:p>
+      <w:pPr>
+        <w:pStyle w:val="TableStyle2"/>
+        <w:numPr>
+          <w:ilvl w:val="0"/>
+          <w:numId w:val="9"/>
+        </w:numPr>
+        <w:tabs>
+          <w:tab w:val="right" w:pos="9360"/>
+        </w:tabs>
+        <w:rPr>
+          <w:rFonts w:ascii="Arial" w:hAnsi="Arial"/>
+        </w:rPr>
+      </w:pPr>
+      <w:r>
+        <w:rPr>
+          <w:rFonts w:ascii="Arial" w:hAnsi="Arial"/>
+        </w:rPr>
+        <w:t xml:space="preserve">Organized and engaged new students at </w:t>
+      </w:r>
+      <w:proofErr w:type="spellStart"/>
+      <w:r>
+        <w:rPr>
+          <w:rFonts w:ascii="Arial" w:hAnsi="Arial"/>
+        </w:rPr>
+        <w:t>SuperComputing</w:t>
+      </w:r>
+      <w:proofErr w:type="spellEnd"/>
+      <w:r>
+        <w:rPr>
+          <w:rFonts w:ascii="Arial" w:hAnsi="Arial"/>
+        </w:rPr>
+        <w:t xml:space="preserve"> through cohort events and discussions</w:t>
+      </w:r>
+    </w:p>
+    <w:p>
+      <w:pPr>
+        <w:pStyle w:val="TableStyle2"/>
+        <w:tabs>
+          <w:tab w:val="right" w:pos="9360"/>
+        </w:tabs>
+        <w:rPr>
+          <w:rFonts w:ascii="Arial" w:hAnsi="Arial"/>
+        </w:rPr>
+      </w:pPr>
+    </w:p>
+    <w:p>
+      <w:pPr>
+        <w:pStyle w:val="TableStyle2"/>
+        <w:tabs>
+          <w:tab w:val="right" w:pos="9360"/>
+        </w:tabs>
+        <w:rPr>
+          <w:rFonts w:ascii="Arial" w:hAnsi="Arial"/>
+        </w:rPr>
+      </w:pPr>
+      <w:r>
+        <w:rPr>
+          <w:rFonts w:ascii="Arial" w:hAnsi="Arial"/>
+        </w:rPr>
         <w:t>Vice President</w:t>
       </w:r>
       <w:r>
@@ -1281,7 +1483,49 @@
         <w:rPr>
           <w:rFonts w:ascii="Arial" w:hAnsi="Arial"/>
         </w:rPr>
-        <w:t>Oversaw 100+ volunteers facilitating conference events</w:t>
+        <w:t xml:space="preserve">Managed </w:t>
+      </w:r>
+      <w:r>
+        <w:rPr>
+          <w:rFonts w:ascii="Arial" w:hAnsi="Arial"/>
+        </w:rPr>
+        <w:t xml:space="preserve">100+ </w:t>
+      </w:r>
+      <w:r>
+        <w:rPr>
+          <w:rFonts w:ascii="Arial" w:hAnsi="Arial"/>
+        </w:rPr>
+        <w:t xml:space="preserve">student </w:t>
+      </w:r>
+      <w:r>
+        <w:rPr>
+          <w:rFonts w:ascii="Arial" w:hAnsi="Arial"/>
+        </w:rPr>
+        <w:t xml:space="preserve">volunteers </w:t>
+      </w:r>
+      <w:r>
+        <w:rPr>
+          <w:rFonts w:ascii="Arial" w:hAnsi="Arial"/>
+        </w:rPr>
+        <w:t xml:space="preserve">to </w:t>
+      </w:r>
+      <w:r>
+        <w:rPr>
+          <w:rFonts w:ascii="Arial" w:hAnsi="Arial"/>
+        </w:rPr>
+        <w:t>facilitat</w:t>
+      </w:r>
+      <w:r>
+        <w:rPr>
+          <w:rFonts w:ascii="Arial" w:hAnsi="Arial"/>
+        </w:rPr>
+        <w:t>e</w:t>
+      </w:r>
+      <w:r>
+        <w:rPr>
+          <w:rFonts w:ascii="Arial" w:hAnsi="Arial"/>
+        </w:rPr>
+        <w:t xml:space="preserve"> conference events</w:t>
       </w:r>
     </w:p>
     <w:p>
@@ -1302,7 +1546,21 @@
         <w:rPr>
           <w:rFonts w:ascii="Arial" w:hAnsi="Arial"/>
         </w:rPr>
-        <w:t>Organized and engaged new students at SuperComputing through cohort events and discussions</w:t>
+        <w:t xml:space="preserve">Organized and engaged new students at </w:t>
+      </w:r>
+      <w:proofErr w:type="spellStart"/>
+      <w:r>
+        <w:rPr>
+          <w:rFonts w:ascii="Arial" w:hAnsi="Arial"/>
+        </w:rPr>
+        <w:t>SuperComputing</w:t>
+      </w:r>
+      <w:proofErr w:type="spellEnd"/>
+      <w:r>
+        <w:rPr>
+          <w:rFonts w:ascii="Arial" w:hAnsi="Arial"/>
+        </w:rPr>
+        <w:t xml:space="preserve"> through cohort events and discussions</w:t>
       </w:r>
     </w:p>
     <w:p>
@@ -1494,11 +1752,16 @@
         </w:numPr>
       </w:pPr>
       <w:r>
-        <w:t>Spring 2023: Developed new course for Clemson University with Assistant Professor Dr. Mert Pes</w:t>
+        <w:t xml:space="preserve">Spring 2023: Developed new course for Clemson University with Assistant Professor Dr. Mert </w:t>
+      </w:r>
+      <w:proofErr w:type="spellStart"/>
+      <w:r>
+        <w:t>Pes</w:t>
       </w:r>
       <w:r>
         <w:t>é</w:t>
       </w:r>
+      <w:proofErr w:type="spellEnd"/>
     </w:p>
     <w:p>
       <w:pPr>
@@ -1571,8 +1834,17 @@
           <w:rFonts w:ascii="Arial" w:hAnsi="Arial"/>
           <w:lang w:val="fr-FR"/>
         </w:rPr>
-        <w:t xml:space="preserve"> lab</w:t>
-      </w:r>
+        <w:t xml:space="preserve"> </w:t>
+      </w:r>
+      <w:proofErr w:type="spellStart"/>
+      <w:r>
+        <w:rPr>
+          <w:rFonts w:ascii="Arial" w:hAnsi="Arial"/>
+          <w:lang w:val="fr-FR"/>
+        </w:rPr>
+        <w:t>lab</w:t>
+      </w:r>
+      <w:proofErr w:type="spellEnd"/>
       <w:r>
         <w:rPr>
           <w:rFonts w:ascii="Arial" w:hAnsi="Arial"/>
@@ -2037,6 +2309,118 @@
     </w:lvl>
   </w:abstractNum>
   <w:abstractNum w:abstractNumId="2" w15:restartNumberingAfterBreak="0">
+    <w:nsid w:val="037E358B"/>
+    <w:multiLevelType w:val="hybridMultilevel"/>
+    <w:tmpl w:val="F562555C"/>
+    <w:lvl w:ilvl="0" w:tplc="01CA14CA">
+      <w:numFmt w:val="bullet"/>
+      <w:lvlText w:val=""/>
+      <w:lvlJc w:val="left"/>
+      <w:pPr>
+        <w:ind w:left="720" w:hanging="360"/>
+      </w:pPr>
+      <w:rPr>
+        <w:rFonts w:ascii="Symbol" w:eastAsia="Helvetica Neue" w:hAnsi="Symbol" w:cs="Helvetica Neue" w:hint="default"/>
+      </w:rPr>
+    </w:lvl>
+    <w:lvl w:ilvl="1" w:tplc="04090003" w:tentative="1">
+      <w:start w:val="1"/>
+      <w:numFmt w:val="bullet"/>
+      <w:lvlText w:val="o"/>
+      <w:lvlJc w:val="left"/>
+      <w:pPr>
+        <w:ind w:left="1440" w:hanging="360"/>
+      </w:pPr>
+      <w:rPr>
+        <w:rFonts w:ascii="Courier New" w:hAnsi="Courier New" w:cs="Courier New" w:hint="default"/>
+      </w:rPr>
+    </w:lvl>
+    <w:lvl w:ilvl="2" w:tplc="04090005" w:tentative="1">
+      <w:start w:val="1"/>
+      <w:numFmt w:val="bullet"/>
+      <w:lvlText w:val=""/>
+      <w:lvlJc w:val="left"/>
+      <w:pPr>
+        <w:ind w:left="2160" w:hanging="360"/>
+      </w:pPr>
+      <w:rPr>
+        <w:rFonts w:ascii="Wingdings" w:hAnsi="Wingdings" w:hint="default"/>
+      </w:rPr>
+    </w:lvl>
+    <w:lvl w:ilvl="3" w:tplc="04090001" w:tentative="1">
+      <w:start w:val="1"/>
+      <w:numFmt w:val="bullet"/>
+      <w:lvlText w:val=""/>
+      <w:lvlJc w:val="left"/>
+      <w:pPr>
+        <w:ind w:left="2880" w:hanging="360"/>
+      </w:pPr>
+      <w:rPr>
+        <w:rFonts w:ascii="Symbol" w:hAnsi="Symbol" w:hint="default"/>
+      </w:rPr>
+    </w:lvl>
+    <w:lvl w:ilvl="4" w:tplc="04090003" w:tentative="1">
+      <w:start w:val="1"/>
+      <w:numFmt w:val="bullet"/>
+      <w:lvlText w:val="o"/>
+      <w:lvlJc w:val="left"/>
+      <w:pPr>
+        <w:ind w:left="3600" w:hanging="360"/>
+      </w:pPr>
+      <w:rPr>
+        <w:rFonts w:ascii="Courier New" w:hAnsi="Courier New" w:cs="Courier New" w:hint="default"/>
+      </w:rPr>
+    </w:lvl>
+    <w:lvl w:ilvl="5" w:tplc="04090005" w:tentative="1">
+      <w:start w:val="1"/>
+      <w:numFmt w:val="bullet"/>
+      <w:lvlText w:val=""/>
+      <w:lvlJc w:val="left"/>
+      <w:pPr>
+        <w:ind w:left="4320" w:hanging="360"/>
+      </w:pPr>
+      <w:rPr>
+        <w:rFonts w:ascii="Wingdings" w:hAnsi="Wingdings" w:hint="default"/>
+      </w:rPr>
+    </w:lvl>
+    <w:lvl w:ilvl="6" w:tplc="04090001" w:tentative="1">
+      <w:start w:val="1"/>
+      <w:numFmt w:val="bullet"/>
+      <w:lvlText w:val=""/>
+      <w:lvlJc w:val="left"/>
+      <w:pPr>
+        <w:ind w:left="5040" w:hanging="360"/>
+      </w:pPr>
+      <w:rPr>
+        <w:rFonts w:ascii="Symbol" w:hAnsi="Symbol" w:hint="default"/>
+      </w:rPr>
+    </w:lvl>
+    <w:lvl w:ilvl="7" w:tplc="04090003" w:tentative="1">
+      <w:start w:val="1"/>
+      <w:numFmt w:val="bullet"/>
+      <w:lvlText w:val="o"/>
+      <w:lvlJc w:val="left"/>
+      <w:pPr>
+        <w:ind w:left="5760" w:hanging="360"/>
+      </w:pPr>
+      <w:rPr>
+        <w:rFonts w:ascii="Courier New" w:hAnsi="Courier New" w:cs="Courier New" w:hint="default"/>
+      </w:rPr>
+    </w:lvl>
+    <w:lvl w:ilvl="8" w:tplc="04090005" w:tentative="1">
+      <w:start w:val="1"/>
+      <w:numFmt w:val="bullet"/>
+      <w:lvlText w:val=""/>
+      <w:lvlJc w:val="left"/>
+      <w:pPr>
+        <w:ind w:left="6480" w:hanging="360"/>
+      </w:pPr>
+      <w:rPr>
+        <w:rFonts w:ascii="Wingdings" w:hAnsi="Wingdings" w:hint="default"/>
+      </w:rPr>
+    </w:lvl>
+  </w:abstractNum>
+  <w:abstractNum w:abstractNumId="3" w15:restartNumberingAfterBreak="0">
     <w:nsid w:val="0C2F1AB8"/>
     <w:multiLevelType w:val="hybridMultilevel"/>
     <w:tmpl w:val="FA066D14"/>
@@ -2148,19 +2532,19 @@
       </w:rPr>
     </w:lvl>
   </w:abstractNum>
-  <w:abstractNum w:abstractNumId="3" w15:restartNumberingAfterBreak="0">
+  <w:abstractNum w:abstractNumId="4" w15:restartNumberingAfterBreak="0">
     <w:nsid w:val="1B2164A2"/>
     <w:multiLevelType w:val="hybridMultilevel"/>
     <w:tmpl w:val="4B42821A"/>
     <w:numStyleLink w:val="BulletBig"/>
   </w:abstractNum>
-  <w:abstractNum w:abstractNumId="4" w15:restartNumberingAfterBreak="0">
+  <w:abstractNum w:abstractNumId="5" w15:restartNumberingAfterBreak="0">
     <w:nsid w:val="3E1020B7"/>
     <w:multiLevelType w:val="hybridMultilevel"/>
     <w:tmpl w:val="E3BC3BBE"/>
     <w:numStyleLink w:val="Bullet"/>
   </w:abstractNum>
-  <w:abstractNum w:abstractNumId="5" w15:restartNumberingAfterBreak="0">
+  <w:abstractNum w:abstractNumId="6" w15:restartNumberingAfterBreak="0">
     <w:nsid w:val="5B5F1638"/>
     <w:multiLevelType w:val="hybridMultilevel"/>
     <w:tmpl w:val="4B42821A"/>
@@ -2436,7 +2820,7 @@
       </w:rPr>
     </w:lvl>
   </w:abstractNum>
-  <w:abstractNum w:abstractNumId="6" w15:restartNumberingAfterBreak="0">
+  <w:abstractNum w:abstractNumId="7" w15:restartNumberingAfterBreak="0">
     <w:nsid w:val="7CC4513A"/>
     <w:multiLevelType w:val="hybridMultilevel"/>
     <w:tmpl w:val="E3BC3BBE"/>
@@ -2695,21 +3079,21 @@
     </w:lvl>
   </w:abstractNum>
   <w:num w:numId="1" w16cid:durableId="1720351718">
+    <w:abstractNumId w:val="7"/>
+  </w:num>
+  <w:num w:numId="2" w16cid:durableId="1294946698">
+    <w:abstractNumId w:val="5"/>
+  </w:num>
+  <w:num w:numId="3" w16cid:durableId="1338339668">
     <w:abstractNumId w:val="6"/>
   </w:num>
-  <w:num w:numId="2" w16cid:durableId="1294946698">
+  <w:num w:numId="4" w16cid:durableId="1561331282">
     <w:abstractNumId w:val="4"/>
   </w:num>
-  <w:num w:numId="3" w16cid:durableId="1338339668">
+  <w:num w:numId="5" w16cid:durableId="1067915513">
     <w:abstractNumId w:val="5"/>
-  </w:num>
-  <w:num w:numId="4" w16cid:durableId="1561331282">
-    <w:abstractNumId w:val="3"/>
-  </w:num>
-  <w:num w:numId="5" w16cid:durableId="1067915513">
-    <w:abstractNumId w:val="4"/>
     <w:lvlOverride w:ilvl="0">
-      <w:lvl w:ilvl="0" w:tplc="6CF42AEA">
+      <w:lvl w:ilvl="0" w:tplc="9D2E7EB8">
         <w:start w:val="1"/>
         <w:numFmt w:val="bullet"/>
         <w:lvlText w:val="•"/>
@@ -2736,7 +3120,7 @@
       </w:lvl>
     </w:lvlOverride>
     <w:lvlOverride w:ilvl="1">
-      <w:lvl w:ilvl="1" w:tplc="B1D4B1E6">
+      <w:lvl w:ilvl="1" w:tplc="FEF838D2">
         <w:start w:val="1"/>
         <w:numFmt w:val="bullet"/>
         <w:lvlText w:val="•"/>
@@ -2763,7 +3147,7 @@
       </w:lvl>
     </w:lvlOverride>
     <w:lvlOverride w:ilvl="2">
-      <w:lvl w:ilvl="2" w:tplc="31F03EC4">
+      <w:lvl w:ilvl="2" w:tplc="2482FB72">
         <w:start w:val="1"/>
         <w:numFmt w:val="bullet"/>
         <w:lvlText w:val="•"/>
@@ -2790,7 +3174,7 @@
       </w:lvl>
     </w:lvlOverride>
     <w:lvlOverride w:ilvl="3">
-      <w:lvl w:ilvl="3" w:tplc="6C34723C">
+      <w:lvl w:ilvl="3" w:tplc="E87A3CEA">
         <w:start w:val="1"/>
         <w:numFmt w:val="bullet"/>
         <w:lvlText w:val="•"/>
@@ -2817,7 +3201,7 @@
       </w:lvl>
     </w:lvlOverride>
     <w:lvlOverride w:ilvl="4">
-      <w:lvl w:ilvl="4" w:tplc="CC9611FC">
+      <w:lvl w:ilvl="4" w:tplc="64B26552">
         <w:start w:val="1"/>
         <w:numFmt w:val="bullet"/>
         <w:lvlText w:val="•"/>
@@ -2844,7 +3228,7 @@
       </w:lvl>
     </w:lvlOverride>
     <w:lvlOverride w:ilvl="5">
-      <w:lvl w:ilvl="5" w:tplc="308848B8">
+      <w:lvl w:ilvl="5" w:tplc="56FA1EB4">
         <w:start w:val="1"/>
         <w:numFmt w:val="bullet"/>
         <w:lvlText w:val="•"/>
@@ -2871,7 +3255,7 @@
       </w:lvl>
     </w:lvlOverride>
     <w:lvlOverride w:ilvl="6">
-      <w:lvl w:ilvl="6" w:tplc="48267132">
+      <w:lvl w:ilvl="6" w:tplc="399C877C">
         <w:start w:val="1"/>
         <w:numFmt w:val="bullet"/>
         <w:lvlText w:val="•"/>
@@ -2898,7 +3282,7 @@
       </w:lvl>
     </w:lvlOverride>
     <w:lvlOverride w:ilvl="7">
-      <w:lvl w:ilvl="7" w:tplc="0D2EED8A">
+      <w:lvl w:ilvl="7" w:tplc="2258F8F4">
         <w:start w:val="1"/>
         <w:numFmt w:val="bullet"/>
         <w:lvlText w:val="•"/>
@@ -2925,7 +3309,7 @@
       </w:lvl>
     </w:lvlOverride>
     <w:lvlOverride w:ilvl="8">
-      <w:lvl w:ilvl="8" w:tplc="699A934A">
+      <w:lvl w:ilvl="8" w:tplc="4E0C7FBE">
         <w:start w:val="1"/>
         <w:numFmt w:val="bullet"/>
         <w:lvlText w:val="•"/>
@@ -2959,6 +3343,9 @@
     <w:abstractNumId w:val="1"/>
   </w:num>
   <w:num w:numId="8" w16cid:durableId="1772508336">
+    <w:abstractNumId w:val="3"/>
+  </w:num>
+  <w:num w:numId="9" w16cid:durableId="1423648199">
     <w:abstractNumId w:val="2"/>
   </w:num>
 </w:numbering>

</xml_diff>

<commit_message>
CV updates, about/contact updates related
</commit_message>
<xml_diff>
--- a/Media/Assets/CV_Word.docx
+++ b/Media/Assets/CV_Word.docx
@@ -271,6 +271,17 @@
       <w:r>
         <w:t xml:space="preserve"> </w:t>
       </w:r>
+      <w:r>
+        <w:t xml:space="preserve">Viewable online at this URL: </w:t>
+      </w:r>
+      <w:hyperlink r:id="rId9" w:history="1">
+        <w:r>
+          <w:rPr>
+            <w:rStyle w:val="Hyperlink"/>
+          </w:rPr>
+          <w:t>https://open.clemson.edu/all_dissertations/3935/</w:t>
+        </w:r>
+      </w:hyperlink>
     </w:p>
     <w:p>
       <w:pPr>
@@ -362,22 +373,6 @@
         </w:tabs>
       </w:pPr>
       <w:r>
-        <w:t>Computer and System Architecture</w:t>
-      </w:r>
-    </w:p>
-    <w:p>
-      <w:pPr>
-        <w:pStyle w:val="Body"/>
-        <w:numPr>
-          <w:ilvl w:val="0"/>
-          <w:numId w:val="6"/>
-        </w:numPr>
-        <w:tabs>
-          <w:tab w:val="clear" w:pos="8910"/>
-          <w:tab w:val="right" w:pos="9360"/>
-        </w:tabs>
-      </w:pPr>
-      <w:r>
         <w:t xml:space="preserve">Systems for </w:t>
       </w:r>
       <w:r>
@@ -430,22 +425,109 @@
       <w:pPr>
         <w:pStyle w:val="Body"/>
         <w:tabs>
+          <w:tab w:val="right" w:pos="9360"/>
+        </w:tabs>
+        <w:spacing w:after="60"/>
+      </w:pPr>
+      <w:r>
+        <w:t>[</w:t>
+      </w:r>
+      <w:r>
+        <w:t xml:space="preserve">In Preparation] Thomas Randall, </w:t>
+      </w:r>
+      <w:proofErr w:type="spellStart"/>
+      <w:r>
+        <w:t>Guoxi</w:t>
+      </w:r>
+      <w:proofErr w:type="spellEnd"/>
+      <w:r>
+        <w:t xml:space="preserve"> Liu, Federico Iuricich and Rong Ge, “Vector-Parallel Tetrahedral Mesh Processing</w:t>
+      </w:r>
+      <w:r>
+        <w:t xml:space="preserve"> for GPUs</w:t>
+      </w:r>
+      <w:r>
+        <w:t>”</w:t>
+      </w:r>
+    </w:p>
+    <w:p>
+      <w:pPr>
+        <w:pStyle w:val="Body"/>
+        <w:tabs>
+          <w:tab w:val="right" w:pos="9360"/>
+        </w:tabs>
+        <w:spacing w:after="60"/>
+      </w:pPr>
+      <w:r>
+        <w:t xml:space="preserve">[In Preparation] Arafat Hossain, </w:t>
+      </w:r>
+      <w:r>
+        <w:t xml:space="preserve">Thomas Randall, </w:t>
+      </w:r>
+      <w:r>
+        <w:t xml:space="preserve">Akash Dutta, </w:t>
+      </w:r>
+      <w:proofErr w:type="spellStart"/>
+      <w:r>
+        <w:t>Xingfu</w:t>
+      </w:r>
+      <w:proofErr w:type="spellEnd"/>
+      <w:r>
+        <w:t xml:space="preserve"> Wu, Rong Ge</w:t>
+      </w:r>
+      <w:r>
+        <w:t>, and Ali Jannesari</w:t>
+      </w:r>
+      <w:r>
+        <w:t xml:space="preserve"> “</w:t>
+      </w:r>
+      <w:r>
+        <w:t>Accelerating Transfer-Learning-Based Autotuning with Predictive LLVM IR Performance Ranking</w:t>
+      </w:r>
+      <w:r>
+        <w:t>”</w:t>
+      </w:r>
+    </w:p>
+    <w:p>
+      <w:pPr>
+        <w:pStyle w:val="Body"/>
+        <w:tabs>
           <w:tab w:val="clear" w:pos="8910"/>
           <w:tab w:val="right" w:pos="9360"/>
         </w:tabs>
         <w:spacing w:after="60"/>
       </w:pPr>
       <w:r>
-        <w:t>[In Prep</w:t>
-      </w:r>
-      <w:r>
-        <w:t>aration</w:t>
+        <w:t>[</w:t>
+      </w:r>
+      <w:r>
+        <w:t>IEEE VIS’25</w:t>
       </w:r>
       <w:r>
         <w:t>]</w:t>
       </w:r>
       <w:r>
-        <w:t xml:space="preserve"> Guoxi Liu, Thomas Randall, Rong Ge and Federico Iuricich, “Efficient Heterogeneous Coordination for Mesh Data Processing”</w:t>
+        <w:t xml:space="preserve"> </w:t>
+      </w:r>
+      <w:proofErr w:type="spellStart"/>
+      <w:r>
+        <w:t>Guoxi</w:t>
+      </w:r>
+      <w:proofErr w:type="spellEnd"/>
+      <w:r>
+        <w:t xml:space="preserve"> Liu, Thomas Randall, Rong Ge and Federico Iuricich, “</w:t>
+      </w:r>
+      <w:r>
+        <w:t>GALE: Leveraging Heterogeneous Systems for Efficient Unstructured Mesh Data Analysis</w:t>
+      </w:r>
+      <w:r>
+        <w:t>,</w:t>
+      </w:r>
+      <w:r>
+        <w:t>”</w:t>
+      </w:r>
+      <w:r>
+        <w:t xml:space="preserve"> In Proceedings of the 2025 IEEE Visualization and Visual Analytics Conference (IEEE VIS 2025)</w:t>
       </w:r>
     </w:p>
     <w:p>
@@ -460,10 +542,33 @@
         <w:t>[</w:t>
       </w:r>
       <w:r>
-        <w:t>In Preparation] Thomas Randall, Guoxi Liu, Federico Iuricich and Rong Ge, “Vector-Parallel Tetrahedral Mesh Processing</w:t>
-      </w:r>
-      <w:r>
-        <w:t xml:space="preserve"> for GPUs</w:t>
+        <w:t>IP</w:t>
+      </w:r>
+      <w:r>
+        <w:t>DPS</w:t>
+      </w:r>
+      <w:r>
+        <w:t>’25 via HPAI4S Workshop</w:t>
+      </w:r>
+      <w:r>
+        <w:t xml:space="preserve">] Thomas Randall, </w:t>
+      </w:r>
+      <w:r>
+        <w:t xml:space="preserve">Akhilesh Bondapalli, </w:t>
+      </w:r>
+      <w:r>
+        <w:t xml:space="preserve">Prasanna </w:t>
+      </w:r>
+      <w:proofErr w:type="spellStart"/>
+      <w:r>
+        <w:t>Balaprakash</w:t>
+      </w:r>
+      <w:proofErr w:type="spellEnd"/>
+      <w:r>
+        <w:t xml:space="preserve"> and Rong Ge, “</w:t>
+      </w:r>
+      <w:r>
+        <w:t>Is In-Context Learning Feasible for HPC Performance Autotuning?</w:t>
       </w:r>
       <w:r>
         <w:t>”</w:t>
@@ -478,25 +583,15 @@
         <w:spacing w:after="60"/>
       </w:pPr>
       <w:r>
-        <w:t xml:space="preserve">[In Preparation] Arafat Hossain, </w:t>
-      </w:r>
-      <w:r>
-        <w:t xml:space="preserve">Thomas Randall, </w:t>
-      </w:r>
-      <w:r>
-        <w:t>Akash Dutta, Xingfu Wu, Rong Ge</w:t>
-      </w:r>
-      <w:r>
-        <w:t>, and Ali Jannesari</w:t>
-      </w:r>
-      <w:r>
-        <w:t xml:space="preserve"> “</w:t>
-      </w:r>
-      <w:r>
-        <w:t>Accelerating Transfer-Learning-Based Autotuning with Predictive LLVM IR Performance Ranking</w:t>
-      </w:r>
-      <w:r>
-        <w:t>”</w:t>
+        <w:t xml:space="preserve">[IGSC’24] Thomas Randall, Bennett Cooper, Naman Kulshreshtha and Rong Ge, “Thermal Behaviors in Liquid Immersion Cooling under Various Workloads: </w:t>
+      </w:r>
+      <w:proofErr w:type="gramStart"/>
+      <w:r>
+        <w:t>a</w:t>
+      </w:r>
+      <w:proofErr w:type="gramEnd"/>
+      <w:r>
+        <w:t xml:space="preserve"> Case Study”, In Proceedings of the 2024 International Green and Sustainable Computing Conference (IGSC ’24)</w:t>
       </w:r>
     </w:p>
     <w:p>
@@ -508,31 +603,23 @@
         <w:spacing w:after="60"/>
       </w:pPr>
       <w:r>
-        <w:t>[</w:t>
-      </w:r>
-      <w:r>
-        <w:t>IP</w:t>
-      </w:r>
-      <w:r>
-        <w:t>DPS</w:t>
-      </w:r>
-      <w:r>
-        <w:t>’25 via HPAI4S Workshop</w:t>
-      </w:r>
-      <w:r>
-        <w:t xml:space="preserve">] Thomas Randall, </w:t>
-      </w:r>
-      <w:r>
-        <w:t xml:space="preserve">Akhilesh Bondapalli, </w:t>
-      </w:r>
-      <w:r>
-        <w:t>Prasanna Balaprakash and Rong Ge, “</w:t>
-      </w:r>
-      <w:r>
-        <w:t>Is In-Context Learning Feasible for HPC Performance Autotuning?</w:t>
-      </w:r>
-      <w:r>
-        <w:t>”</w:t>
+        <w:t>[DoECyberCon’24] Thomas Randall, Rong Ge, Prasanna Balaprakash, “</w:t>
+      </w:r>
+      <w:proofErr w:type="gramStart"/>
+      <w:r>
+        <w:t>Copy Cat</w:t>
+      </w:r>
+      <w:proofErr w:type="gramEnd"/>
+      <w:r>
+        <w:t>: Limitations of LLMs in Performance Predictions,” Poster appearing in Department of Energy Cybersecurity and Technology Innovation 2024 (</w:t>
+      </w:r>
+      <w:proofErr w:type="spellStart"/>
+      <w:r>
+        <w:t>DoECyberCon</w:t>
+      </w:r>
+      <w:proofErr w:type="spellEnd"/>
+      <w:r>
+        <w:t xml:space="preserve"> ’24)</w:t>
       </w:r>
     </w:p>
     <w:p>
@@ -544,31 +631,23 @@
         <w:spacing w:after="60"/>
       </w:pPr>
       <w:r>
-        <w:t>[IGSC’24] Thomas Randall, Bennett Cooper, Naman Kulshreshtha and Rong Ge, “Thermal Behaviors in Liquid Immersion Cooling under Various Workloads: a Case Study”, In Proceedings of the 2024 International Green and Sustainable Computing Conference (IGSC ’24)</w:t>
-      </w:r>
-    </w:p>
-    <w:p>
-      <w:pPr>
-        <w:pStyle w:val="Body"/>
-        <w:tabs>
-          <w:tab w:val="right" w:pos="9360"/>
-        </w:tabs>
-        <w:spacing w:after="60"/>
-      </w:pPr>
-      <w:r>
-        <w:t>[DoECyberCon’24] Thomas Randall, Rong Ge, Prasanna Balaprakash, “Copy Cat: Limitations of LLMs in Performance Predictions,” Poster appearing in Department of Energy Cybersecurity and Technology Innovation 2024 (DoECyberCon ’24)</w:t>
-      </w:r>
-    </w:p>
-    <w:p>
-      <w:pPr>
-        <w:pStyle w:val="Body"/>
-        <w:tabs>
-          <w:tab w:val="right" w:pos="9360"/>
-        </w:tabs>
-        <w:spacing w:after="60"/>
-      </w:pPr>
-      <w:r>
-        <w:t>[ICS’23] Thomas Randall, Jaehoon Koo, Brice Videau, Michael Kruse, Xingfu Wu, Paul Hovland, Mary</w:t>
+        <w:t xml:space="preserve">[ICS’23] Thomas Randall, </w:t>
+      </w:r>
+      <w:proofErr w:type="spellStart"/>
+      <w:r>
+        <w:t>Jaehoon</w:t>
+      </w:r>
+      <w:proofErr w:type="spellEnd"/>
+      <w:r>
+        <w:t xml:space="preserve"> Koo, Brice Videau, Michael Kruse, </w:t>
+      </w:r>
+      <w:proofErr w:type="spellStart"/>
+      <w:r>
+        <w:t>Xingfu</w:t>
+      </w:r>
+      <w:proofErr w:type="spellEnd"/>
+      <w:r>
+        <w:t xml:space="preserve"> Wu, Paul Hovland, Mary</w:t>
       </w:r>
       <w:r>
         <w:t xml:space="preserve"> </w:t>
@@ -576,7 +655,7 @@
       <w:r>
         <w:t>Hall, Rong Ge and Prasanna Balaprakash, “</w:t>
       </w:r>
-      <w:hyperlink r:id="rId9" w:history="1">
+      <w:hyperlink r:id="rId10" w:history="1">
         <w:r>
           <w:rPr>
             <w:rStyle w:val="Hyperlink"/>
@@ -618,7 +697,7 @@
       <w:r>
         <w:t xml:space="preserve"> Thomas Randall, Tyler Allen, and Rong Ge, "</w:t>
       </w:r>
-      <w:hyperlink r:id="rId10" w:history="1">
+      <w:hyperlink r:id="rId11" w:history="1">
         <w:r>
           <w:rPr>
             <w:rStyle w:val="Hyperlink0"/>
@@ -820,7 +899,7 @@
           <w:rFonts w:ascii="Arial" w:hAnsi="Arial"/>
         </w:rPr>
       </w:pPr>
-      <w:hyperlink r:id="rId11" w:history="1">
+      <w:hyperlink r:id="rId12" w:history="1">
         <w:r>
           <w:rPr>
             <w:rStyle w:val="Hyperlink"/>
@@ -1386,7 +1465,21 @@
         <w:rPr>
           <w:rFonts w:ascii="Arial" w:hAnsi="Arial"/>
         </w:rPr>
-        <w:t>Organized and engaged new students at SuperComputing through cohort events and discussions</w:t>
+        <w:t xml:space="preserve">Organized and engaged new students at </w:t>
+      </w:r>
+      <w:proofErr w:type="spellStart"/>
+      <w:r>
+        <w:rPr>
+          <w:rFonts w:ascii="Arial" w:hAnsi="Arial"/>
+        </w:rPr>
+        <w:t>SuperComputing</w:t>
+      </w:r>
+      <w:proofErr w:type="spellEnd"/>
+      <w:r>
+        <w:rPr>
+          <w:rFonts w:ascii="Arial" w:hAnsi="Arial"/>
+        </w:rPr>
+        <w:t xml:space="preserve"> through cohort events and discussions</w:t>
       </w:r>
     </w:p>
     <w:p>
@@ -1692,7 +1785,21 @@
         <w:rPr>
           <w:rFonts w:ascii="Arial" w:hAnsi="Arial"/>
         </w:rPr>
-        <w:t>Organized and engaged new students at SuperComputing through cohort events and discussions</w:t>
+        <w:t xml:space="preserve">Organized and engaged new students at </w:t>
+      </w:r>
+      <w:proofErr w:type="spellStart"/>
+      <w:r>
+        <w:rPr>
+          <w:rFonts w:ascii="Arial" w:hAnsi="Arial"/>
+        </w:rPr>
+        <w:t>SuperComputing</w:t>
+      </w:r>
+      <w:proofErr w:type="spellEnd"/>
+      <w:r>
+        <w:rPr>
+          <w:rFonts w:ascii="Arial" w:hAnsi="Arial"/>
+        </w:rPr>
+        <w:t xml:space="preserve"> through cohort events and discussions</w:t>
       </w:r>
     </w:p>
     <w:p>
@@ -1992,11 +2099,16 @@
         </w:numPr>
       </w:pPr>
       <w:r>
-        <w:t>Spring 2023: Developed new course for Clemson University with Assistant Professor Dr. Mert Pes</w:t>
+        <w:t xml:space="preserve">Spring 2023: Developed new course for Clemson University with Assistant Professor Dr. Mert </w:t>
+      </w:r>
+      <w:proofErr w:type="spellStart"/>
+      <w:r>
+        <w:t>Pes</w:t>
       </w:r>
       <w:r>
         <w:t>é</w:t>
       </w:r>
+      <w:proofErr w:type="spellEnd"/>
     </w:p>
     <w:p>
       <w:pPr>
@@ -2060,8 +2172,17 @@
           <w:rFonts w:ascii="Arial" w:hAnsi="Arial"/>
           <w:lang w:val="fr-FR"/>
         </w:rPr>
-        <w:t xml:space="preserve"> lab</w:t>
-      </w:r>
+        <w:t xml:space="preserve"> </w:t>
+      </w:r>
+      <w:proofErr w:type="spellStart"/>
+      <w:r>
+        <w:rPr>
+          <w:rFonts w:ascii="Arial" w:hAnsi="Arial"/>
+          <w:lang w:val="fr-FR"/>
+        </w:rPr>
+        <w:t>lab</w:t>
+      </w:r>
+      <w:proofErr w:type="spellEnd"/>
       <w:r>
         <w:rPr>
           <w:rFonts w:ascii="Arial" w:hAnsi="Arial"/>
@@ -2100,8 +2221,8 @@
       </w:r>
     </w:p>
     <w:sectPr>
-      <w:headerReference w:type="default" r:id="rId12"/>
-      <w:footerReference w:type="default" r:id="rId13"/>
+      <w:headerReference w:type="default" r:id="rId13"/>
+      <w:footerReference w:type="default" r:id="rId14"/>
       <w:pgSz w:w="12240" w:h="15840"/>
       <w:pgMar w:top="720" w:right="1440" w:bottom="720" w:left="1440" w:header="720" w:footer="864" w:gutter="0"/>
       <w:cols w:space="720"/>
@@ -3146,7 +3267,7 @@
   <w:num w:numId="5" w16cid:durableId="1067915513">
     <w:abstractNumId w:val="5"/>
     <w:lvlOverride w:ilvl="0">
-      <w:lvl w:ilvl="0" w:tplc="17B85860">
+      <w:lvl w:ilvl="0" w:tplc="30DA8D16">
         <w:start w:val="1"/>
         <w:numFmt w:val="bullet"/>
         <w:lvlText w:val="•"/>
@@ -3173,7 +3294,7 @@
       </w:lvl>
     </w:lvlOverride>
     <w:lvlOverride w:ilvl="1">
-      <w:lvl w:ilvl="1" w:tplc="B2501D18">
+      <w:lvl w:ilvl="1" w:tplc="273E02EA">
         <w:start w:val="1"/>
         <w:numFmt w:val="bullet"/>
         <w:lvlText w:val="•"/>
@@ -3200,7 +3321,7 @@
       </w:lvl>
     </w:lvlOverride>
     <w:lvlOverride w:ilvl="2">
-      <w:lvl w:ilvl="2" w:tplc="860E2D5E">
+      <w:lvl w:ilvl="2" w:tplc="19BED84C">
         <w:start w:val="1"/>
         <w:numFmt w:val="bullet"/>
         <w:lvlText w:val="•"/>
@@ -3227,7 +3348,7 @@
       </w:lvl>
     </w:lvlOverride>
     <w:lvlOverride w:ilvl="3">
-      <w:lvl w:ilvl="3" w:tplc="F8C40538">
+      <w:lvl w:ilvl="3" w:tplc="828A7298">
         <w:start w:val="1"/>
         <w:numFmt w:val="bullet"/>
         <w:lvlText w:val="•"/>
@@ -3254,7 +3375,7 @@
       </w:lvl>
     </w:lvlOverride>
     <w:lvlOverride w:ilvl="4">
-      <w:lvl w:ilvl="4" w:tplc="916ED2BE">
+      <w:lvl w:ilvl="4" w:tplc="CD389B78">
         <w:start w:val="1"/>
         <w:numFmt w:val="bullet"/>
         <w:lvlText w:val="•"/>
@@ -3281,7 +3402,7 @@
       </w:lvl>
     </w:lvlOverride>
     <w:lvlOverride w:ilvl="5">
-      <w:lvl w:ilvl="5" w:tplc="7D2C8738">
+      <w:lvl w:ilvl="5" w:tplc="BBD6A838">
         <w:start w:val="1"/>
         <w:numFmt w:val="bullet"/>
         <w:lvlText w:val="•"/>
@@ -3308,7 +3429,7 @@
       </w:lvl>
     </w:lvlOverride>
     <w:lvlOverride w:ilvl="6">
-      <w:lvl w:ilvl="6" w:tplc="EB6E847A">
+      <w:lvl w:ilvl="6" w:tplc="0E10EF1E">
         <w:start w:val="1"/>
         <w:numFmt w:val="bullet"/>
         <w:lvlText w:val="•"/>
@@ -3335,7 +3456,7 @@
       </w:lvl>
     </w:lvlOverride>
     <w:lvlOverride w:ilvl="7">
-      <w:lvl w:ilvl="7" w:tplc="CC9875D2">
+      <w:lvl w:ilvl="7" w:tplc="FD067AE2">
         <w:start w:val="1"/>
         <w:numFmt w:val="bullet"/>
         <w:lvlText w:val="•"/>
@@ -3362,7 +3483,7 @@
       </w:lvl>
     </w:lvlOverride>
     <w:lvlOverride w:ilvl="8">
-      <w:lvl w:ilvl="8" w:tplc="967E000C">
+      <w:lvl w:ilvl="8" w:tplc="ABF0A380">
         <w:start w:val="1"/>
         <w:numFmt w:val="bullet"/>
         <w:lvlText w:val="•"/>
@@ -3816,7 +3937,6 @@
   <w:style w:type="character" w:default="1" w:styleId="DefaultParagraphFont">
     <w:name w:val="Default Paragraph Font"/>
     <w:uiPriority w:val="1"/>
-    <w:semiHidden/>
     <w:unhideWhenUsed/>
   </w:style>
   <w:style w:type="table" w:default="1" w:styleId="TableNormal">

</xml_diff>